<commit_message>
Draw one Admin / Teacher actor in the shared modules, with no arrow
In the twelve modules the Admin and the Teacher share, the two actors
and the generalization arrow between them become a single actor named
for both roles, "Admin / Teacher", joined to every use case in the box,
the way the KAPSTON2 capstone draws an actor several roles share.

The written use cases say the same: the remark in each shared use case
now reads "The Admin and Teacher share this use case", and the notes at
the top describe the one Admin / Teacher actor instead of inheritance.

Co-Authored-By: Claude Opus 5.5 <noreply@anthropic.com>
</commit_message>
<xml_diff>
--- a/DIAGRAMS/CAMS-Use-Case-Specifications.docx
+++ b/DIAGRAMS/CAMS-Use-Case-Specifications.docx
@@ -67,7 +67,7 @@
         <w:pStyle w:val="Heading1"/>
         <w:pageBreakBefore/>
       </w:pPr>
-      <w:bookmarkStart w:id="0" w:name="_Toc241751587"/>
+      <w:bookmarkStart w:id="0" w:name="_Toc241760969"/>
       <w:r>
         <w:lastRenderedPageBreak/>
         <w:t>About this document</w:t>
@@ -101,7 +101,7 @@
         <w:t>ADMIN AND TEACHER</w:t>
       </w:r>
       <w:r>
-        <w:t>. The use cases are joined to Admin, and Teacher points to Admin with a hollow triangle (generalization), so the teacher inherits them.</w:t>
+        <w:t>, with one actor named Admin / Teacher.</w:t>
       </w:r>
     </w:p>
     <w:p>
@@ -151,7 +151,7 @@
     <w:sdt>
       <w:sdtPr>
         <w:alias w:val="Contents"/>
-        <w:id w:val="621814121"/>
+        <w:id w:val="1601758230"/>
       </w:sdtPr>
       <w:sdtEndPr>
         <w:rPr>
@@ -183,7 +183,7 @@
           <w:r>
             <w:fldChar w:fldCharType="separate"/>
           </w:r>
-          <w:hyperlink w:anchor="_Toc241751587" w:history="1">
+          <w:hyperlink w:anchor="_Toc241760969" w:history="1">
             <w:r>
               <w:rPr>
                 <w:rStyle w:val="Hyperlink"/>
@@ -207,7 +207,7 @@
               <w:rPr>
                 <w:noProof/>
               </w:rPr>
-              <w:instrText xml:space="preserve"> PAGEREF _Toc241751587 \h </w:instrText>
+              <w:instrText xml:space="preserve"> PAGEREF _Toc241760969 \h </w:instrText>
             </w:r>
             <w:r>
               <w:rPr>
@@ -249,7 +249,7 @@
               <w14:ligatures w14:val="standardContextual"/>
             </w:rPr>
           </w:pPr>
-          <w:hyperlink w:anchor="_Toc241751588" w:history="1">
+          <w:hyperlink w:anchor="_Toc241760970" w:history="1">
             <w:r>
               <w:rPr>
                 <w:rStyle w:val="Hyperlink"/>
@@ -273,7 +273,7 @@
               <w:rPr>
                 <w:noProof/>
               </w:rPr>
-              <w:instrText xml:space="preserve"> PAGEREF _Toc241751588 \h </w:instrText>
+              <w:instrText xml:space="preserve"> PAGEREF _Toc241760970 \h </w:instrText>
             </w:r>
             <w:r>
               <w:rPr>
@@ -315,7 +315,7 @@
               <w14:ligatures w14:val="standardContextual"/>
             </w:rPr>
           </w:pPr>
-          <w:hyperlink w:anchor="_Toc241751589" w:history="1">
+          <w:hyperlink w:anchor="_Toc241760971" w:history="1">
             <w:r>
               <w:rPr>
                 <w:rStyle w:val="Hyperlink"/>
@@ -339,7 +339,7 @@
               <w:rPr>
                 <w:noProof/>
               </w:rPr>
-              <w:instrText xml:space="preserve"> PAGEREF _Toc241751589 \h </w:instrText>
+              <w:instrText xml:space="preserve"> PAGEREF _Toc241760971 \h </w:instrText>
             </w:r>
             <w:r>
               <w:rPr>
@@ -381,7 +381,7 @@
               <w14:ligatures w14:val="standardContextual"/>
             </w:rPr>
           </w:pPr>
-          <w:hyperlink w:anchor="_Toc241751590" w:history="1">
+          <w:hyperlink w:anchor="_Toc241760972" w:history="1">
             <w:r>
               <w:rPr>
                 <w:rStyle w:val="Hyperlink"/>
@@ -405,7 +405,7 @@
               <w:rPr>
                 <w:noProof/>
               </w:rPr>
-              <w:instrText xml:space="preserve"> PAGEREF _Toc241751590 \h </w:instrText>
+              <w:instrText xml:space="preserve"> PAGEREF _Toc241760972 \h </w:instrText>
             </w:r>
             <w:r>
               <w:rPr>
@@ -447,7 +447,7 @@
               <w14:ligatures w14:val="standardContextual"/>
             </w:rPr>
           </w:pPr>
-          <w:hyperlink w:anchor="_Toc241751591" w:history="1">
+          <w:hyperlink w:anchor="_Toc241760973" w:history="1">
             <w:r>
               <w:rPr>
                 <w:rStyle w:val="Hyperlink"/>
@@ -471,7 +471,7 @@
               <w:rPr>
                 <w:noProof/>
               </w:rPr>
-              <w:instrText xml:space="preserve"> PAGEREF _Toc241751591 \h </w:instrText>
+              <w:instrText xml:space="preserve"> PAGEREF _Toc241760973 \h </w:instrText>
             </w:r>
             <w:r>
               <w:rPr>
@@ -513,7 +513,7 @@
               <w14:ligatures w14:val="standardContextual"/>
             </w:rPr>
           </w:pPr>
-          <w:hyperlink w:anchor="_Toc241751592" w:history="1">
+          <w:hyperlink w:anchor="_Toc241760974" w:history="1">
             <w:r>
               <w:rPr>
                 <w:rStyle w:val="Hyperlink"/>
@@ -537,7 +537,7 @@
               <w:rPr>
                 <w:noProof/>
               </w:rPr>
-              <w:instrText xml:space="preserve"> PAGEREF _Toc241751592 \h </w:instrText>
+              <w:instrText xml:space="preserve"> PAGEREF _Toc241760974 \h </w:instrText>
             </w:r>
             <w:r>
               <w:rPr>
@@ -579,7 +579,7 @@
               <w14:ligatures w14:val="standardContextual"/>
             </w:rPr>
           </w:pPr>
-          <w:hyperlink w:anchor="_Toc241751593" w:history="1">
+          <w:hyperlink w:anchor="_Toc241760975" w:history="1">
             <w:r>
               <w:rPr>
                 <w:rStyle w:val="Hyperlink"/>
@@ -603,7 +603,7 @@
               <w:rPr>
                 <w:noProof/>
               </w:rPr>
-              <w:instrText xml:space="preserve"> PAGEREF _Toc241751593 \h </w:instrText>
+              <w:instrText xml:space="preserve"> PAGEREF _Toc241760975 \h </w:instrText>
             </w:r>
             <w:r>
               <w:rPr>
@@ -645,7 +645,7 @@
               <w14:ligatures w14:val="standardContextual"/>
             </w:rPr>
           </w:pPr>
-          <w:hyperlink w:anchor="_Toc241751594" w:history="1">
+          <w:hyperlink w:anchor="_Toc241760976" w:history="1">
             <w:r>
               <w:rPr>
                 <w:rStyle w:val="Hyperlink"/>
@@ -669,7 +669,7 @@
               <w:rPr>
                 <w:noProof/>
               </w:rPr>
-              <w:instrText xml:space="preserve"> PAGEREF _Toc241751594 \h </w:instrText>
+              <w:instrText xml:space="preserve"> PAGEREF _Toc241760976 \h </w:instrText>
             </w:r>
             <w:r>
               <w:rPr>
@@ -711,7 +711,7 @@
               <w14:ligatures w14:val="standardContextual"/>
             </w:rPr>
           </w:pPr>
-          <w:hyperlink w:anchor="_Toc241751595" w:history="1">
+          <w:hyperlink w:anchor="_Toc241760977" w:history="1">
             <w:r>
               <w:rPr>
                 <w:rStyle w:val="Hyperlink"/>
@@ -735,7 +735,7 @@
               <w:rPr>
                 <w:noProof/>
               </w:rPr>
-              <w:instrText xml:space="preserve"> PAGEREF _Toc241751595 \h </w:instrText>
+              <w:instrText xml:space="preserve"> PAGEREF _Toc241760977 \h </w:instrText>
             </w:r>
             <w:r>
               <w:rPr>
@@ -777,7 +777,7 @@
               <w14:ligatures w14:val="standardContextual"/>
             </w:rPr>
           </w:pPr>
-          <w:hyperlink w:anchor="_Toc241751596" w:history="1">
+          <w:hyperlink w:anchor="_Toc241760978" w:history="1">
             <w:r>
               <w:rPr>
                 <w:rStyle w:val="Hyperlink"/>
@@ -801,7 +801,7 @@
               <w:rPr>
                 <w:noProof/>
               </w:rPr>
-              <w:instrText xml:space="preserve"> PAGEREF _Toc241751596 \h </w:instrText>
+              <w:instrText xml:space="preserve"> PAGEREF _Toc241760978 \h </w:instrText>
             </w:r>
             <w:r>
               <w:rPr>
@@ -843,7 +843,7 @@
               <w14:ligatures w14:val="standardContextual"/>
             </w:rPr>
           </w:pPr>
-          <w:hyperlink w:anchor="_Toc241751597" w:history="1">
+          <w:hyperlink w:anchor="_Toc241760979" w:history="1">
             <w:r>
               <w:rPr>
                 <w:rStyle w:val="Hyperlink"/>
@@ -867,7 +867,7 @@
               <w:rPr>
                 <w:noProof/>
               </w:rPr>
-              <w:instrText xml:space="preserve"> PAGEREF _Toc241751597 \h </w:instrText>
+              <w:instrText xml:space="preserve"> PAGEREF _Toc241760979 \h </w:instrText>
             </w:r>
             <w:r>
               <w:rPr>
@@ -909,7 +909,7 @@
               <w14:ligatures w14:val="standardContextual"/>
             </w:rPr>
           </w:pPr>
-          <w:hyperlink w:anchor="_Toc241751598" w:history="1">
+          <w:hyperlink w:anchor="_Toc241760980" w:history="1">
             <w:r>
               <w:rPr>
                 <w:rStyle w:val="Hyperlink"/>
@@ -933,7 +933,7 @@
               <w:rPr>
                 <w:noProof/>
               </w:rPr>
-              <w:instrText xml:space="preserve"> PAGEREF _Toc241751598 \h </w:instrText>
+              <w:instrText xml:space="preserve"> PAGEREF _Toc241760980 \h </w:instrText>
             </w:r>
             <w:r>
               <w:rPr>
@@ -975,7 +975,7 @@
               <w14:ligatures w14:val="standardContextual"/>
             </w:rPr>
           </w:pPr>
-          <w:hyperlink w:anchor="_Toc241751599" w:history="1">
+          <w:hyperlink w:anchor="_Toc241760981" w:history="1">
             <w:r>
               <w:rPr>
                 <w:rStyle w:val="Hyperlink"/>
@@ -999,7 +999,7 @@
               <w:rPr>
                 <w:noProof/>
               </w:rPr>
-              <w:instrText xml:space="preserve"> PAGEREF _Toc241751599 \h </w:instrText>
+              <w:instrText xml:space="preserve"> PAGEREF _Toc241760981 \h </w:instrText>
             </w:r>
             <w:r>
               <w:rPr>
@@ -1041,7 +1041,7 @@
               <w14:ligatures w14:val="standardContextual"/>
             </w:rPr>
           </w:pPr>
-          <w:hyperlink w:anchor="_Toc241751600" w:history="1">
+          <w:hyperlink w:anchor="_Toc241760982" w:history="1">
             <w:r>
               <w:rPr>
                 <w:rStyle w:val="Hyperlink"/>
@@ -1065,7 +1065,7 @@
               <w:rPr>
                 <w:noProof/>
               </w:rPr>
-              <w:instrText xml:space="preserve"> PAGEREF _Toc241751600 \h </w:instrText>
+              <w:instrText xml:space="preserve"> PAGEREF _Toc241760982 \h </w:instrText>
             </w:r>
             <w:r>
               <w:rPr>
@@ -1107,7 +1107,7 @@
               <w14:ligatures w14:val="standardContextual"/>
             </w:rPr>
           </w:pPr>
-          <w:hyperlink w:anchor="_Toc241751601" w:history="1">
+          <w:hyperlink w:anchor="_Toc241760983" w:history="1">
             <w:r>
               <w:rPr>
                 <w:rStyle w:val="Hyperlink"/>
@@ -1131,7 +1131,7 @@
               <w:rPr>
                 <w:noProof/>
               </w:rPr>
-              <w:instrText xml:space="preserve"> PAGEREF _Toc241751601 \h </w:instrText>
+              <w:instrText xml:space="preserve"> PAGEREF _Toc241760983 \h </w:instrText>
             </w:r>
             <w:r>
               <w:rPr>
@@ -1173,7 +1173,7 @@
               <w14:ligatures w14:val="standardContextual"/>
             </w:rPr>
           </w:pPr>
-          <w:hyperlink w:anchor="_Toc241751602" w:history="1">
+          <w:hyperlink w:anchor="_Toc241760984" w:history="1">
             <w:r>
               <w:rPr>
                 <w:rStyle w:val="Hyperlink"/>
@@ -1197,7 +1197,7 @@
               <w:rPr>
                 <w:noProof/>
               </w:rPr>
-              <w:instrText xml:space="preserve"> PAGEREF _Toc241751602 \h </w:instrText>
+              <w:instrText xml:space="preserve"> PAGEREF _Toc241760984 \h </w:instrText>
             </w:r>
             <w:r>
               <w:rPr>
@@ -1239,7 +1239,7 @@
               <w14:ligatures w14:val="standardContextual"/>
             </w:rPr>
           </w:pPr>
-          <w:hyperlink w:anchor="_Toc241751603" w:history="1">
+          <w:hyperlink w:anchor="_Toc241760985" w:history="1">
             <w:r>
               <w:rPr>
                 <w:rStyle w:val="Hyperlink"/>
@@ -1263,7 +1263,7 @@
               <w:rPr>
                 <w:noProof/>
               </w:rPr>
-              <w:instrText xml:space="preserve"> PAGEREF _Toc241751603 \h </w:instrText>
+              <w:instrText xml:space="preserve"> PAGEREF _Toc241760985 \h </w:instrText>
             </w:r>
             <w:r>
               <w:rPr>
@@ -1305,7 +1305,7 @@
               <w14:ligatures w14:val="standardContextual"/>
             </w:rPr>
           </w:pPr>
-          <w:hyperlink w:anchor="_Toc241751604" w:history="1">
+          <w:hyperlink w:anchor="_Toc241760986" w:history="1">
             <w:r>
               <w:rPr>
                 <w:rStyle w:val="Hyperlink"/>
@@ -1329,7 +1329,7 @@
               <w:rPr>
                 <w:noProof/>
               </w:rPr>
-              <w:instrText xml:space="preserve"> PAGEREF _Toc241751604 \h </w:instrText>
+              <w:instrText xml:space="preserve"> PAGEREF _Toc241760986 \h </w:instrText>
             </w:r>
             <w:r>
               <w:rPr>
@@ -1371,7 +1371,7 @@
               <w14:ligatures w14:val="standardContextual"/>
             </w:rPr>
           </w:pPr>
-          <w:hyperlink w:anchor="_Toc241751605" w:history="1">
+          <w:hyperlink w:anchor="_Toc241760987" w:history="1">
             <w:r>
               <w:rPr>
                 <w:rStyle w:val="Hyperlink"/>
@@ -1395,7 +1395,7 @@
               <w:rPr>
                 <w:noProof/>
               </w:rPr>
-              <w:instrText xml:space="preserve"> PAGEREF _Toc241751605 \h </w:instrText>
+              <w:instrText xml:space="preserve"> PAGEREF _Toc241760987 \h </w:instrText>
             </w:r>
             <w:r>
               <w:rPr>
@@ -1437,7 +1437,7 @@
               <w14:ligatures w14:val="standardContextual"/>
             </w:rPr>
           </w:pPr>
-          <w:hyperlink w:anchor="_Toc241751606" w:history="1">
+          <w:hyperlink w:anchor="_Toc241760988" w:history="1">
             <w:r>
               <w:rPr>
                 <w:rStyle w:val="Hyperlink"/>
@@ -1461,7 +1461,7 @@
               <w:rPr>
                 <w:noProof/>
               </w:rPr>
-              <w:instrText xml:space="preserve"> PAGEREF _Toc241751606 \h </w:instrText>
+              <w:instrText xml:space="preserve"> PAGEREF _Toc241760988 \h </w:instrText>
             </w:r>
             <w:r>
               <w:rPr>
@@ -1503,7 +1503,7 @@
               <w14:ligatures w14:val="standardContextual"/>
             </w:rPr>
           </w:pPr>
-          <w:hyperlink w:anchor="_Toc241751607" w:history="1">
+          <w:hyperlink w:anchor="_Toc241760989" w:history="1">
             <w:r>
               <w:rPr>
                 <w:rStyle w:val="Hyperlink"/>
@@ -1527,7 +1527,7 @@
               <w:rPr>
                 <w:noProof/>
               </w:rPr>
-              <w:instrText xml:space="preserve"> PAGEREF _Toc241751607 \h </w:instrText>
+              <w:instrText xml:space="preserve"> PAGEREF _Toc241760989 \h </w:instrText>
             </w:r>
             <w:r>
               <w:rPr>
@@ -1569,7 +1569,7 @@
               <w14:ligatures w14:val="standardContextual"/>
             </w:rPr>
           </w:pPr>
-          <w:hyperlink w:anchor="_Toc241751608" w:history="1">
+          <w:hyperlink w:anchor="_Toc241760990" w:history="1">
             <w:r>
               <w:rPr>
                 <w:rStyle w:val="Hyperlink"/>
@@ -1593,7 +1593,7 @@
               <w:rPr>
                 <w:noProof/>
               </w:rPr>
-              <w:instrText xml:space="preserve"> PAGEREF _Toc241751608 \h </w:instrText>
+              <w:instrText xml:space="preserve"> PAGEREF _Toc241760990 \h </w:instrText>
             </w:r>
             <w:r>
               <w:rPr>
@@ -1635,7 +1635,7 @@
               <w14:ligatures w14:val="standardContextual"/>
             </w:rPr>
           </w:pPr>
-          <w:hyperlink w:anchor="_Toc241751609" w:history="1">
+          <w:hyperlink w:anchor="_Toc241760991" w:history="1">
             <w:r>
               <w:rPr>
                 <w:rStyle w:val="Hyperlink"/>
@@ -1659,7 +1659,7 @@
               <w:rPr>
                 <w:noProof/>
               </w:rPr>
-              <w:instrText xml:space="preserve"> PAGEREF _Toc241751609 \h </w:instrText>
+              <w:instrText xml:space="preserve"> PAGEREF _Toc241760991 \h </w:instrText>
             </w:r>
             <w:r>
               <w:rPr>
@@ -1701,7 +1701,7 @@
               <w14:ligatures w14:val="standardContextual"/>
             </w:rPr>
           </w:pPr>
-          <w:hyperlink w:anchor="_Toc241751610" w:history="1">
+          <w:hyperlink w:anchor="_Toc241760992" w:history="1">
             <w:r>
               <w:rPr>
                 <w:rStyle w:val="Hyperlink"/>
@@ -1725,7 +1725,7 @@
               <w:rPr>
                 <w:noProof/>
               </w:rPr>
-              <w:instrText xml:space="preserve"> PAGEREF _Toc241751610 \h </w:instrText>
+              <w:instrText xml:space="preserve"> PAGEREF _Toc241760992 \h </w:instrText>
             </w:r>
             <w:r>
               <w:rPr>
@@ -1767,7 +1767,7 @@
               <w14:ligatures w14:val="standardContextual"/>
             </w:rPr>
           </w:pPr>
-          <w:hyperlink w:anchor="_Toc241751611" w:history="1">
+          <w:hyperlink w:anchor="_Toc241760993" w:history="1">
             <w:r>
               <w:rPr>
                 <w:rStyle w:val="Hyperlink"/>
@@ -1791,7 +1791,7 @@
               <w:rPr>
                 <w:noProof/>
               </w:rPr>
-              <w:instrText xml:space="preserve"> PAGEREF _Toc241751611 \h </w:instrText>
+              <w:instrText xml:space="preserve"> PAGEREF _Toc241760993 \h </w:instrText>
             </w:r>
             <w:r>
               <w:rPr>
@@ -1833,7 +1833,7 @@
               <w14:ligatures w14:val="standardContextual"/>
             </w:rPr>
           </w:pPr>
-          <w:hyperlink w:anchor="_Toc241751612" w:history="1">
+          <w:hyperlink w:anchor="_Toc241760994" w:history="1">
             <w:r>
               <w:rPr>
                 <w:rStyle w:val="Hyperlink"/>
@@ -1857,7 +1857,7 @@
               <w:rPr>
                 <w:noProof/>
               </w:rPr>
-              <w:instrText xml:space="preserve"> PAGEREF _Toc241751612 \h </w:instrText>
+              <w:instrText xml:space="preserve"> PAGEREF _Toc241760994 \h </w:instrText>
             </w:r>
             <w:r>
               <w:rPr>
@@ -1899,7 +1899,7 @@
               <w14:ligatures w14:val="standardContextual"/>
             </w:rPr>
           </w:pPr>
-          <w:hyperlink w:anchor="_Toc241751613" w:history="1">
+          <w:hyperlink w:anchor="_Toc241760995" w:history="1">
             <w:r>
               <w:rPr>
                 <w:rStyle w:val="Hyperlink"/>
@@ -1923,7 +1923,7 @@
               <w:rPr>
                 <w:noProof/>
               </w:rPr>
-              <w:instrText xml:space="preserve"> PAGEREF _Toc241751613 \h </w:instrText>
+              <w:instrText xml:space="preserve"> PAGEREF _Toc241760995 \h </w:instrText>
             </w:r>
             <w:r>
               <w:rPr>
@@ -1965,7 +1965,7 @@
               <w14:ligatures w14:val="standardContextual"/>
             </w:rPr>
           </w:pPr>
-          <w:hyperlink w:anchor="_Toc241751614" w:history="1">
+          <w:hyperlink w:anchor="_Toc241760996" w:history="1">
             <w:r>
               <w:rPr>
                 <w:rStyle w:val="Hyperlink"/>
@@ -1989,7 +1989,7 @@
               <w:rPr>
                 <w:noProof/>
               </w:rPr>
-              <w:instrText xml:space="preserve"> PAGEREF _Toc241751614 \h </w:instrText>
+              <w:instrText xml:space="preserve"> PAGEREF _Toc241760996 \h </w:instrText>
             </w:r>
             <w:r>
               <w:rPr>
@@ -2031,7 +2031,7 @@
               <w14:ligatures w14:val="standardContextual"/>
             </w:rPr>
           </w:pPr>
-          <w:hyperlink w:anchor="_Toc241751615" w:history="1">
+          <w:hyperlink w:anchor="_Toc241760997" w:history="1">
             <w:r>
               <w:rPr>
                 <w:rStyle w:val="Hyperlink"/>
@@ -2055,7 +2055,7 @@
               <w:rPr>
                 <w:noProof/>
               </w:rPr>
-              <w:instrText xml:space="preserve"> PAGEREF _Toc241751615 \h </w:instrText>
+              <w:instrText xml:space="preserve"> PAGEREF _Toc241760997 \h </w:instrText>
             </w:r>
             <w:r>
               <w:rPr>
@@ -2097,7 +2097,7 @@
               <w14:ligatures w14:val="standardContextual"/>
             </w:rPr>
           </w:pPr>
-          <w:hyperlink w:anchor="_Toc241751616" w:history="1">
+          <w:hyperlink w:anchor="_Toc241760998" w:history="1">
             <w:r>
               <w:rPr>
                 <w:rStyle w:val="Hyperlink"/>
@@ -2121,7 +2121,7 @@
               <w:rPr>
                 <w:noProof/>
               </w:rPr>
-              <w:instrText xml:space="preserve"> PAGEREF _Toc241751616 \h </w:instrText>
+              <w:instrText xml:space="preserve"> PAGEREF _Toc241760998 \h </w:instrText>
             </w:r>
             <w:r>
               <w:rPr>
@@ -2163,7 +2163,7 @@
               <w14:ligatures w14:val="standardContextual"/>
             </w:rPr>
           </w:pPr>
-          <w:hyperlink w:anchor="_Toc241751617" w:history="1">
+          <w:hyperlink w:anchor="_Toc241760999" w:history="1">
             <w:r>
               <w:rPr>
                 <w:rStyle w:val="Hyperlink"/>
@@ -2187,7 +2187,7 @@
               <w:rPr>
                 <w:noProof/>
               </w:rPr>
-              <w:instrText xml:space="preserve"> PAGEREF _Toc241751617 \h </w:instrText>
+              <w:instrText xml:space="preserve"> PAGEREF _Toc241760999 \h </w:instrText>
             </w:r>
             <w:r>
               <w:rPr>
@@ -2226,7 +2226,7 @@
         <w:pStyle w:val="Heading1"/>
         <w:pageBreakBefore/>
       </w:pPr>
-      <w:bookmarkStart w:id="1" w:name="_Toc241751588"/>
+      <w:bookmarkStart w:id="1" w:name="_Toc241760970"/>
       <w:r>
         <w:lastRenderedPageBreak/>
         <w:t>ADMIN AND TEACHER</w:t>
@@ -2240,7 +2240,7 @@
         <w:jc w:val="both"/>
       </w:pPr>
       <w:r>
-        <w:t>The admin and the teacher can both do the use cases in these system use cases. The use cases are joined to Admin, and the line with a hollow triangle from Teacher to Admin is a generalization: the teacher inherits the admin's use cases here.</w:t>
+        <w:t>The admin and the teacher can both do the use cases in these system use cases, so each diagram shows one actor named Admin / Teacher.</w:t>
       </w:r>
     </w:p>
     <w:p>
@@ -2257,7 +2257,7 @@
       <w:pPr>
         <w:pStyle w:val="Heading2"/>
       </w:pPr>
-      <w:bookmarkStart w:id="2" w:name="_Toc241751589"/>
+      <w:bookmarkStart w:id="2" w:name="_Toc241760971"/>
       <w:r>
         <w:t>Process Log In</w:t>
       </w:r>
@@ -2275,8 +2275,8 @@
           <w:noProof/>
         </w:rPr>
         <w:drawing>
-          <wp:inline distT="0" distB="0" distL="0" distR="0" wp14:anchorId="1F1FF1CB" wp14:editId="278BC6F9">
-            <wp:extent cx="3629025" cy="2390775"/>
+          <wp:inline distT="0" distB="0" distL="0" distR="0" wp14:anchorId="2FB7EC13" wp14:editId="3DE867A0">
+            <wp:extent cx="4086225" cy="2362200"/>
             <wp:effectExtent l="0" t="0" r="0" b="0"/>
             <wp:docPr id="1" name="Process Log In" descr="System use case diagram for Process Log In" title="Process Log In system use case"/>
             <wp:cNvGraphicFramePr>
@@ -2301,7 +2301,7 @@
                   <pic:spPr bwMode="auto">
                     <a:xfrm>
                       <a:off x="0" y="0"/>
-                      <a:ext cx="3629025" cy="2390775"/>
+                      <a:ext cx="4086225" cy="2362200"/>
                     </a:xfrm>
                     <a:prstGeom prst="rect">
                       <a:avLst/>
@@ -2376,7 +2376,10 @@
         <w:t>Purpose:</w:t>
       </w:r>
       <w:r>
-        <w:t xml:space="preserve"> To allow the Admin and Teacher to log in to CAMS using their username and password.</w:t>
+        <w:t xml:space="preserve"> </w:t>
+      </w:r>
+      <w:r>
+        <w:t>To allow the Admin and Teacher to log in to CAMS using their username and password.</w:t>
       </w:r>
     </w:p>
     <w:p>
@@ -2472,48 +2475,48 @@
         <w:jc w:val="both"/>
       </w:pPr>
       <w:r>
+        <w:t>Login error message</w:t>
+      </w:r>
+    </w:p>
+    <w:p>
+      <w:pPr>
+        <w:keepNext/>
+        <w:ind w:left="720"/>
+        <w:jc w:val="both"/>
+      </w:pPr>
+      <w:r>
+        <w:rPr>
+          <w:b/>
+          <w:bCs/>
+        </w:rPr>
+        <w:t>Pre-Condition:</w:t>
+      </w:r>
+    </w:p>
+    <w:p>
+      <w:pPr>
+        <w:pStyle w:val="ListParagraph"/>
+        <w:numPr>
+          <w:ilvl w:val="0"/>
+          <w:numId w:val="2"/>
+        </w:numPr>
+        <w:jc w:val="both"/>
+      </w:pPr>
+      <w:r>
+        <w:t>The user must have an active account in the system.</w:t>
+      </w:r>
+    </w:p>
+    <w:p>
+      <w:pPr>
+        <w:keepNext/>
+        <w:ind w:left="720"/>
+        <w:jc w:val="both"/>
+      </w:pPr>
+      <w:r>
+        <w:rPr>
+          <w:b/>
+          <w:bCs/>
+        </w:rPr>
         <w:lastRenderedPageBreak/>
-        <w:t>Login error message</w:t>
-      </w:r>
-    </w:p>
-    <w:p>
-      <w:pPr>
-        <w:keepNext/>
-        <w:ind w:left="720"/>
-        <w:jc w:val="both"/>
-      </w:pPr>
-      <w:r>
-        <w:rPr>
-          <w:b/>
-          <w:bCs/>
-        </w:rPr>
-        <w:t>Pre-Condition:</w:t>
-      </w:r>
-    </w:p>
-    <w:p>
-      <w:pPr>
-        <w:pStyle w:val="ListParagraph"/>
-        <w:numPr>
-          <w:ilvl w:val="0"/>
-          <w:numId w:val="2"/>
-        </w:numPr>
-        <w:jc w:val="both"/>
-      </w:pPr>
-      <w:r>
-        <w:t>The user must have an active account in the system.</w:t>
-      </w:r>
-    </w:p>
-    <w:p>
-      <w:pPr>
-        <w:keepNext/>
-        <w:ind w:left="720"/>
-        <w:jc w:val="both"/>
-      </w:pPr>
-      <w:r>
-        <w:rPr>
-          <w:b/>
-          <w:bCs/>
-        </w:rPr>
         <w:t>Post-Condition:</w:t>
       </w:r>
     </w:p>
@@ -2807,7 +2810,7 @@
         <w:jc w:val="both"/>
       </w:pPr>
       <w:r>
-        <w:t>The Teacher inherits this use case from the Admin (generalization).</w:t>
+        <w:t>The Admin and Teacher share this use case. The diagram shows them as one Admin / Teacher actor.</w:t>
       </w:r>
     </w:p>
     <w:p>
@@ -2828,7 +2831,7 @@
         <w:pStyle w:val="Heading2"/>
         <w:pageBreakBefore/>
       </w:pPr>
-      <w:bookmarkStart w:id="3" w:name="_Toc241751590"/>
+      <w:bookmarkStart w:id="3" w:name="_Toc241760972"/>
       <w:r>
         <w:lastRenderedPageBreak/>
         <w:t>Process Sign Out</w:t>
@@ -2847,8 +2850,8 @@
           <w:noProof/>
         </w:rPr>
         <w:drawing>
-          <wp:inline distT="0" distB="0" distL="0" distR="0" wp14:anchorId="385D0A36" wp14:editId="645D8598">
-            <wp:extent cx="3629025" cy="2390775"/>
+          <wp:inline distT="0" distB="0" distL="0" distR="0" wp14:anchorId="17DC2CFC" wp14:editId="74B67A70">
+            <wp:extent cx="4086225" cy="2362200"/>
             <wp:effectExtent l="0" t="0" r="0" b="0"/>
             <wp:docPr id="2" name="Process Sign Out" descr="System use case diagram for Process Sign Out" title="Process Sign Out system use case"/>
             <wp:cNvGraphicFramePr>
@@ -2873,7 +2876,7 @@
                   <pic:spPr bwMode="auto">
                     <a:xfrm>
                       <a:off x="0" y="0"/>
-                      <a:ext cx="3629025" cy="2390775"/>
+                      <a:ext cx="4086225" cy="2362200"/>
                     </a:xfrm>
                     <a:prstGeom prst="rect">
                       <a:avLst/>
@@ -3206,7 +3209,7 @@
         <w:jc w:val="both"/>
       </w:pPr>
       <w:r>
-        <w:t>The Teacher inherits this use case from the Admin (generalization).</w:t>
+        <w:t>The Admin and Teacher share this use case. The diagram shows them as one Admin / Teacher actor.</w:t>
       </w:r>
     </w:p>
     <w:p>
@@ -3227,7 +3230,7 @@
         <w:pStyle w:val="Heading2"/>
         <w:pageBreakBefore/>
       </w:pPr>
-      <w:bookmarkStart w:id="4" w:name="_Toc241751591"/>
+      <w:bookmarkStart w:id="4" w:name="_Toc241760973"/>
       <w:r>
         <w:lastRenderedPageBreak/>
         <w:t>Manage Own Account</w:t>
@@ -3246,8 +3249,8 @@
           <w:noProof/>
         </w:rPr>
         <w:drawing>
-          <wp:inline distT="0" distB="0" distL="0" distR="0" wp14:anchorId="72DAF919" wp14:editId="55932EF7">
-            <wp:extent cx="3629025" cy="2390775"/>
+          <wp:inline distT="0" distB="0" distL="0" distR="0" wp14:anchorId="1784120D" wp14:editId="40B53DD6">
+            <wp:extent cx="4086225" cy="2362200"/>
             <wp:effectExtent l="0" t="0" r="0" b="0"/>
             <wp:docPr id="3" name="Manage Own Account" descr="System use case diagram for Manage Own Account" title="Manage Own Account system use case"/>
             <wp:cNvGraphicFramePr>
@@ -3272,7 +3275,7 @@
                   <pic:spPr bwMode="auto">
                     <a:xfrm>
                       <a:off x="0" y="0"/>
-                      <a:ext cx="3629025" cy="2390775"/>
+                      <a:ext cx="4086225" cy="2362200"/>
                     </a:xfrm>
                     <a:prstGeom prst="rect">
                       <a:avLst/>
@@ -3347,7 +3350,10 @@
         <w:t>Purpose:</w:t>
       </w:r>
       <w:r>
-        <w:t xml:space="preserve"> To allow the Admin and Teacher to change their own password.</w:t>
+        <w:t xml:space="preserve"> </w:t>
+      </w:r>
+      <w:r>
+        <w:t>To allow the Admin and Teacher to change their own password.</w:t>
       </w:r>
     </w:p>
     <w:p>
@@ -3724,7 +3730,7 @@
         <w:jc w:val="both"/>
       </w:pPr>
       <w:r>
-        <w:t>The Teacher inherits this use case from the Admin (generalization).</w:t>
+        <w:t>The Admin and Teacher share this use case. The diagram shows them as one Admin / Teacher actor.</w:t>
       </w:r>
     </w:p>
     <w:p>
@@ -3745,7 +3751,7 @@
         <w:pStyle w:val="Heading2"/>
         <w:pageBreakBefore/>
       </w:pPr>
-      <w:bookmarkStart w:id="5" w:name="_Toc241751592"/>
+      <w:bookmarkStart w:id="5" w:name="_Toc241760974"/>
       <w:r>
         <w:lastRenderedPageBreak/>
         <w:t>Manage Teacher Account</w:t>
@@ -3764,8 +3770,8 @@
           <w:noProof/>
         </w:rPr>
         <w:drawing>
-          <wp:inline distT="0" distB="0" distL="0" distR="0" wp14:anchorId="0A7D8F61" wp14:editId="0DF220F5">
-            <wp:extent cx="3181350" cy="5334000"/>
+          <wp:inline distT="0" distB="0" distL="0" distR="0" wp14:anchorId="04120EAA" wp14:editId="43C95405">
+            <wp:extent cx="3590925" cy="5334000"/>
             <wp:effectExtent l="0" t="0" r="0" b="0"/>
             <wp:docPr id="4" name="Manage Teacher Account" descr="System use case diagram for Manage Teacher Account" title="Manage Teacher Account system use case"/>
             <wp:cNvGraphicFramePr>
@@ -3790,7 +3796,7 @@
                   <pic:spPr bwMode="auto">
                     <a:xfrm>
                       <a:off x="0" y="0"/>
-                      <a:ext cx="3181350" cy="5334000"/>
+                      <a:ext cx="3590925" cy="5334000"/>
                     </a:xfrm>
                     <a:prstGeom prst="rect">
                       <a:avLst/>
@@ -3832,43 +3838,43 @@
         <w:t>Written Use Case:</w:t>
       </w:r>
       <w:r>
+        <w:t xml:space="preserve"> Manage Teacher Account</w:t>
+      </w:r>
+    </w:p>
+    <w:p>
+      <w:pPr>
+        <w:keepNext/>
+        <w:ind w:left="720"/>
+        <w:jc w:val="both"/>
+      </w:pPr>
+      <w:r>
+        <w:rPr>
+          <w:b/>
+          <w:bCs/>
+        </w:rPr>
+        <w:t>Use Case Name:</w:t>
+      </w:r>
+      <w:r>
+        <w:t xml:space="preserve"> Create Teacher, Update Teacher, Toggle Teacher Status, Unlock Teacher Account</w:t>
+      </w:r>
+    </w:p>
+    <w:p>
+      <w:pPr>
+        <w:ind w:left="720"/>
+        <w:jc w:val="both"/>
+      </w:pPr>
+      <w:r>
+        <w:rPr>
+          <w:b/>
+          <w:bCs/>
+        </w:rPr>
+        <w:t>Purpose:</w:t>
+      </w:r>
+      <w:r>
         <w:t xml:space="preserve"> </w:t>
       </w:r>
       <w:r>
-        <w:t>Manage Teacher Account</w:t>
-      </w:r>
-    </w:p>
-    <w:p>
-      <w:pPr>
-        <w:keepNext/>
-        <w:ind w:left="720"/>
-        <w:jc w:val="both"/>
-      </w:pPr>
-      <w:r>
-        <w:rPr>
-          <w:b/>
-          <w:bCs/>
-        </w:rPr>
-        <w:t>Use Case Name:</w:t>
-      </w:r>
-      <w:r>
-        <w:t xml:space="preserve"> Create Teacher, Update Teacher, Toggle Teacher Status, Unlock Teacher Account</w:t>
-      </w:r>
-    </w:p>
-    <w:p>
-      <w:pPr>
-        <w:ind w:left="720"/>
-        <w:jc w:val="both"/>
-      </w:pPr>
-      <w:r>
-        <w:rPr>
-          <w:b/>
-          <w:bCs/>
-        </w:rPr>
-        <w:t>Purpose:</w:t>
-      </w:r>
-      <w:r>
-        <w:t xml:space="preserve"> To allow the Admin and Teacher to manage teacher accounts in CAMS by adding, editing, activating or deactivating, and unlocking accounts.</w:t>
+        <w:t>To allow the Admin and Teacher to manage teacher accounts in CAMS by adding, editing, activating or deactivating, and unlocking accounts.</w:t>
       </w:r>
     </w:p>
     <w:p>
@@ -4389,7 +4395,7 @@
         <w:jc w:val="both"/>
       </w:pPr>
       <w:r>
-        <w:t>The Teacher inherits this use case from the Admin (generalization).</w:t>
+        <w:t>The Admin and Teacher share this use case. The diagram shows them as one Admin / Teacher actor.</w:t>
       </w:r>
     </w:p>
     <w:p>
@@ -4423,7 +4429,7 @@
         <w:pStyle w:val="Heading2"/>
         <w:pageBreakBefore/>
       </w:pPr>
-      <w:bookmarkStart w:id="6" w:name="_Toc241751593"/>
+      <w:bookmarkStart w:id="6" w:name="_Toc241760975"/>
       <w:r>
         <w:lastRenderedPageBreak/>
         <w:t>Manage Student Account</w:t>
@@ -4442,8 +4448,8 @@
           <w:noProof/>
         </w:rPr>
         <w:drawing>
-          <wp:inline distT="0" distB="0" distL="0" distR="0" wp14:anchorId="1CE70AA2" wp14:editId="668FA218">
-            <wp:extent cx="4114800" cy="4295775"/>
+          <wp:inline distT="0" distB="0" distL="0" distR="0" wp14:anchorId="1DA90981" wp14:editId="78DE4A7D">
+            <wp:extent cx="4114800" cy="3981450"/>
             <wp:effectExtent l="0" t="0" r="0" b="0"/>
             <wp:docPr id="5" name="Manage Student Account" descr="System use case diagram for Manage Student Account" title="Manage Student Account system use case"/>
             <wp:cNvGraphicFramePr>
@@ -4468,7 +4474,7 @@
                   <pic:spPr bwMode="auto">
                     <a:xfrm>
                       <a:off x="0" y="0"/>
-                      <a:ext cx="4114800" cy="4295775"/>
+                      <a:ext cx="4114800" cy="3981450"/>
                     </a:xfrm>
                     <a:prstGeom prst="rect">
                       <a:avLst/>
@@ -4717,20 +4723,20 @@
         <w:jc w:val="both"/>
       </w:pPr>
       <w:r>
+        <w:t>List of wrong rows, if an import fails</w:t>
+      </w:r>
+    </w:p>
+    <w:p>
+      <w:pPr>
+        <w:pStyle w:val="ListParagraph"/>
+        <w:numPr>
+          <w:ilvl w:val="0"/>
+          <w:numId w:val="2"/>
+        </w:numPr>
+        <w:jc w:val="both"/>
+      </w:pPr>
+      <w:r>
         <w:lastRenderedPageBreak/>
-        <w:t>List of wrong rows, if an import fails</w:t>
-      </w:r>
-    </w:p>
-    <w:p>
-      <w:pPr>
-        <w:pStyle w:val="ListParagraph"/>
-        <w:numPr>
-          <w:ilvl w:val="0"/>
-          <w:numId w:val="2"/>
-        </w:numPr>
-        <w:jc w:val="both"/>
-      </w:pPr>
-      <w:r>
         <w:t>Success or error message</w:t>
       </w:r>
     </w:p>
@@ -5090,7 +5096,7 @@
         <w:jc w:val="both"/>
       </w:pPr>
       <w:r>
-        <w:t>The Teacher inherits this use case from the Admin (generalization).</w:t>
+        <w:t>The Admin and Teacher share this use case. The diagram shows them as one Admin / Teacher actor.</w:t>
       </w:r>
     </w:p>
     <w:p>
@@ -5124,7 +5130,7 @@
         <w:pStyle w:val="Heading2"/>
         <w:pageBreakBefore/>
       </w:pPr>
-      <w:bookmarkStart w:id="7" w:name="_Toc241751594"/>
+      <w:bookmarkStart w:id="7" w:name="_Toc241760976"/>
       <w:r>
         <w:lastRenderedPageBreak/>
         <w:t>Manage Computer Profile</w:t>
@@ -5143,8 +5149,8 @@
           <w:noProof/>
         </w:rPr>
         <w:drawing>
-          <wp:inline distT="0" distB="0" distL="0" distR="0" wp14:anchorId="2F4A6A3B" wp14:editId="54DA2868">
-            <wp:extent cx="3181350" cy="5334000"/>
+          <wp:inline distT="0" distB="0" distL="0" distR="0" wp14:anchorId="02DC9932" wp14:editId="63EDC956">
+            <wp:extent cx="3590925" cy="5334000"/>
             <wp:effectExtent l="0" t="0" r="0" b="0"/>
             <wp:docPr id="6" name="Manage Computer Profile" descr="System use case diagram for Manage Computer Profile" title="Manage Computer Profile system use case"/>
             <wp:cNvGraphicFramePr>
@@ -5169,7 +5175,7 @@
                   <pic:spPr bwMode="auto">
                     <a:xfrm>
                       <a:off x="0" y="0"/>
-                      <a:ext cx="3181350" cy="5334000"/>
+                      <a:ext cx="3590925" cy="5334000"/>
                     </a:xfrm>
                     <a:prstGeom prst="rect">
                       <a:avLst/>
@@ -5726,7 +5732,7 @@
         <w:jc w:val="both"/>
       </w:pPr>
       <w:r>
-        <w:t>The Teacher inherits this use case from the Admin (generalization).</w:t>
+        <w:t>The Admin and Teacher share this use case. The diagram shows them as one Admin / Teacher actor.</w:t>
       </w:r>
     </w:p>
     <w:p>
@@ -5760,7 +5766,7 @@
         <w:pStyle w:val="Heading2"/>
         <w:pageBreakBefore/>
       </w:pPr>
-      <w:bookmarkStart w:id="8" w:name="_Toc241751595"/>
+      <w:bookmarkStart w:id="8" w:name="_Toc241760977"/>
       <w:r>
         <w:lastRenderedPageBreak/>
         <w:t>Manage Class</w:t>
@@ -5779,8 +5785,8 @@
           <w:noProof/>
         </w:rPr>
         <w:drawing>
-          <wp:inline distT="0" distB="0" distL="0" distR="0" wp14:anchorId="504D08DA" wp14:editId="365982B1">
-            <wp:extent cx="2647950" cy="5334000"/>
+          <wp:inline distT="0" distB="0" distL="0" distR="0" wp14:anchorId="3451CE99" wp14:editId="416F92B5">
+            <wp:extent cx="2981325" cy="5334000"/>
             <wp:effectExtent l="0" t="0" r="0" b="0"/>
             <wp:docPr id="7" name="Manage Class" descr="System use case diagram for Manage Class" title="Manage Class system use case"/>
             <wp:cNvGraphicFramePr>
@@ -5805,7 +5811,7 @@
                   <pic:spPr bwMode="auto">
                     <a:xfrm>
                       <a:off x="0" y="0"/>
-                      <a:ext cx="2647950" cy="5334000"/>
+                      <a:ext cx="2981325" cy="5334000"/>
                     </a:xfrm>
                     <a:prstGeom prst="rect">
                       <a:avLst/>
@@ -6457,19 +6463,20 @@
         <w:jc w:val="both"/>
       </w:pPr>
       <w:r>
-        <w:t>The Teacher inherits this use case from the Admin (generalization).</w:t>
-      </w:r>
-    </w:p>
-    <w:p>
-      <w:pPr>
-        <w:pStyle w:val="ListParagraph"/>
-        <w:numPr>
-          <w:ilvl w:val="0"/>
-          <w:numId w:val="2"/>
-        </w:numPr>
-        <w:jc w:val="both"/>
-      </w:pPr>
-      <w:r>
+        <w:t>The Admin and Teacher share this use case. The diagram shows them as one Admin / Teacher actor.</w:t>
+      </w:r>
+    </w:p>
+    <w:p>
+      <w:pPr>
+        <w:pStyle w:val="ListParagraph"/>
+        <w:numPr>
+          <w:ilvl w:val="0"/>
+          <w:numId w:val="2"/>
+        </w:numPr>
+        <w:jc w:val="both"/>
+      </w:pPr>
+      <w:r>
+        <w:lastRenderedPageBreak/>
         <w:t>A class made by a teacher belongs to that teacher.</w:t>
       </w:r>
     </w:p>
@@ -6483,7 +6490,6 @@
         <w:jc w:val="both"/>
       </w:pPr>
       <w:r>
-        <w:lastRenderedPageBreak/>
         <w:t>Choosing the teacher of a class is for the Admin only (Manage Class Teacher).</w:t>
       </w:r>
     </w:p>
@@ -6505,7 +6511,7 @@
         <w:pStyle w:val="Heading2"/>
         <w:pageBreakBefore/>
       </w:pPr>
-      <w:bookmarkStart w:id="9" w:name="_Toc241751596"/>
+      <w:bookmarkStart w:id="9" w:name="_Toc241760978"/>
       <w:r>
         <w:lastRenderedPageBreak/>
         <w:t>Manage Restriction Rule</w:t>
@@ -6524,8 +6530,8 @@
           <w:noProof/>
         </w:rPr>
         <w:drawing>
-          <wp:inline distT="0" distB="0" distL="0" distR="0" wp14:anchorId="22F77E91" wp14:editId="0BBF5858">
-            <wp:extent cx="3629025" cy="4838700"/>
+          <wp:inline distT="0" distB="0" distL="0" distR="0" wp14:anchorId="705BFC66" wp14:editId="13EEBC4F">
+            <wp:extent cx="4086225" cy="4838700"/>
             <wp:effectExtent l="0" t="0" r="0" b="0"/>
             <wp:docPr id="8" name="Manage Restriction Rule" descr="System use case diagram for Manage Restriction Rule" title="Manage Restriction Rule system use case"/>
             <wp:cNvGraphicFramePr>
@@ -6550,7 +6556,7 @@
                   <pic:spPr bwMode="auto">
                     <a:xfrm>
                       <a:off x="0" y="0"/>
-                      <a:ext cx="3629025" cy="4838700"/>
+                      <a:ext cx="4086225" cy="4838700"/>
                     </a:xfrm>
                     <a:prstGeom prst="rect">
                       <a:avLst/>
@@ -7123,7 +7129,7 @@
         <w:jc w:val="both"/>
       </w:pPr>
       <w:r>
-        <w:t>The Teacher inherits this use case from the Admin (generalization).</w:t>
+        <w:t>The Admin and Teacher share this use case. The diagram shows them as one Admin / Teacher actor.</w:t>
       </w:r>
     </w:p>
     <w:p>
@@ -7157,7 +7163,7 @@
         <w:pStyle w:val="Heading2"/>
         <w:pageBreakBefore/>
       </w:pPr>
-      <w:bookmarkStart w:id="10" w:name="_Toc241751597"/>
+      <w:bookmarkStart w:id="10" w:name="_Toc241760979"/>
       <w:r>
         <w:lastRenderedPageBreak/>
         <w:t>Manage Blacklist and Whitelist</w:t>
@@ -7176,8 +7182,8 @@
           <w:noProof/>
         </w:rPr>
         <w:drawing>
-          <wp:inline distT="0" distB="0" distL="0" distR="0" wp14:anchorId="46ACEF60" wp14:editId="736813AF">
-            <wp:extent cx="2266950" cy="5334000"/>
+          <wp:inline distT="0" distB="0" distL="0" distR="0" wp14:anchorId="48BAE1DD" wp14:editId="4477B9D8">
+            <wp:extent cx="2552700" cy="5334000"/>
             <wp:effectExtent l="0" t="0" r="0" b="0"/>
             <wp:docPr id="9" name="Manage Blacklist and Whitelist" descr="System use case diagram for Manage Blacklist and Whitelist" title="Manage Blacklist and Whitelist system use case"/>
             <wp:cNvGraphicFramePr>
@@ -7202,7 +7208,7 @@
                   <pic:spPr bwMode="auto">
                     <a:xfrm>
                       <a:off x="0" y="0"/>
-                      <a:ext cx="2266950" cy="5334000"/>
+                      <a:ext cx="2552700" cy="5334000"/>
                     </a:xfrm>
                     <a:prstGeom prst="rect">
                       <a:avLst/>
@@ -7277,7 +7283,10 @@
         <w:t>Purpose:</w:t>
       </w:r>
       <w:r>
-        <w:t xml:space="preserve"> To allow the Admin and Teacher to manage the blacklist of blocked websites and apps and the whitelist of allowed websites by adding, editing and deleting entries.</w:t>
+        <w:t xml:space="preserve"> </w:t>
+      </w:r>
+      <w:r>
+        <w:t>To allow the Admin and Teacher to manage the blacklist of blocked websites and apps and the whitelist of allowed websites by adding, editing and deleting entries.</w:t>
       </w:r>
     </w:p>
     <w:p>
@@ -7758,7 +7767,7 @@
         <w:jc w:val="both"/>
       </w:pPr>
       <w:r>
-        <w:t>The Teacher inherits this use case from the Admin (generalization).</w:t>
+        <w:t>The Admin and Teacher share this use case. The diagram shows them as one Admin / Teacher actor.</w:t>
       </w:r>
     </w:p>
     <w:p>
@@ -7805,7 +7814,7 @@
         <w:pStyle w:val="Heading2"/>
         <w:pageBreakBefore/>
       </w:pPr>
-      <w:bookmarkStart w:id="11" w:name="_Toc241751598"/>
+      <w:bookmarkStart w:id="11" w:name="_Toc241760980"/>
       <w:r>
         <w:lastRenderedPageBreak/>
         <w:t>Manage Category</w:t>
@@ -7824,8 +7833,8 @@
           <w:noProof/>
         </w:rPr>
         <w:drawing>
-          <wp:inline distT="0" distB="0" distL="0" distR="0" wp14:anchorId="7AC80A4B" wp14:editId="673FEAD6">
-            <wp:extent cx="3629025" cy="4838700"/>
+          <wp:inline distT="0" distB="0" distL="0" distR="0" wp14:anchorId="40217626" wp14:editId="5EBE721C">
+            <wp:extent cx="4086225" cy="4838700"/>
             <wp:effectExtent l="0" t="0" r="0" b="0"/>
             <wp:docPr id="10" name="Manage Category" descr="System use case diagram for Manage Category" title="Manage Category system use case"/>
             <wp:cNvGraphicFramePr>
@@ -7850,7 +7859,7 @@
                   <pic:spPr bwMode="auto">
                     <a:xfrm>
                       <a:off x="0" y="0"/>
-                      <a:ext cx="3629025" cy="4838700"/>
+                      <a:ext cx="4086225" cy="4838700"/>
                     </a:xfrm>
                     <a:prstGeom prst="rect">
                       <a:avLst/>
@@ -8380,7 +8389,7 @@
         <w:jc w:val="both"/>
       </w:pPr>
       <w:r>
-        <w:t>The Teacher inherits this use case from the Admin (generalization).</w:t>
+        <w:t>The Admin and Teacher share this use case. The diagram shows them as one Admin / Teacher actor.</w:t>
       </w:r>
     </w:p>
     <w:p>
@@ -8414,7 +8423,7 @@
         <w:pStyle w:val="Heading2"/>
         <w:pageBreakBefore/>
       </w:pPr>
-      <w:bookmarkStart w:id="12" w:name="_Toc241751599"/>
+      <w:bookmarkStart w:id="12" w:name="_Toc241760981"/>
       <w:r>
         <w:lastRenderedPageBreak/>
         <w:t>Manage Session Rule</w:t>
@@ -8433,8 +8442,8 @@
           <w:noProof/>
         </w:rPr>
         <w:drawing>
-          <wp:inline distT="0" distB="0" distL="0" distR="0" wp14:anchorId="1A20FCDF" wp14:editId="7E91A46A">
-            <wp:extent cx="3629025" cy="4838700"/>
+          <wp:inline distT="0" distB="0" distL="0" distR="0" wp14:anchorId="4B2C8200" wp14:editId="05840E13">
+            <wp:extent cx="4086225" cy="4838700"/>
             <wp:effectExtent l="0" t="0" r="0" b="0"/>
             <wp:docPr id="11" name="Manage Session Rule" descr="System use case diagram for Manage Session Rule" title="Manage Session Rule system use case"/>
             <wp:cNvGraphicFramePr>
@@ -8459,7 +8468,7 @@
                   <pic:spPr bwMode="auto">
                     <a:xfrm>
                       <a:off x="0" y="0"/>
-                      <a:ext cx="3629025" cy="4838700"/>
+                      <a:ext cx="4086225" cy="4838700"/>
                     </a:xfrm>
                     <a:prstGeom prst="rect">
                       <a:avLst/>
@@ -8518,7 +8527,10 @@
         <w:t>Use Case Name:</w:t>
       </w:r>
       <w:r>
-        <w:t xml:space="preserve"> Create Session Rule, Update Session Rule, Toggle Session Rule Status</w:t>
+        <w:t xml:space="preserve"> </w:t>
+      </w:r>
+      <w:r>
+        <w:t>Create Session Rule, Update Session Rule, Toggle Session Rule Status</w:t>
       </w:r>
     </w:p>
     <w:p>
@@ -8989,7 +9001,7 @@
         <w:jc w:val="both"/>
       </w:pPr>
       <w:r>
-        <w:t>The Teacher inherits this use case from the Admin (generalization).</w:t>
+        <w:t>The Admin and Teacher share this use case. The diagram shows them as one Admin / Teacher actor.</w:t>
       </w:r>
     </w:p>
     <w:p>
@@ -9023,7 +9035,7 @@
         <w:pStyle w:val="Heading2"/>
         <w:pageBreakBefore/>
       </w:pPr>
-      <w:bookmarkStart w:id="13" w:name="_Toc241751600"/>
+      <w:bookmarkStart w:id="13" w:name="_Toc241760982"/>
       <w:r>
         <w:lastRenderedPageBreak/>
         <w:t>Control Laboratory Session</w:t>
@@ -9042,8 +9054,8 @@
           <w:noProof/>
         </w:rPr>
         <w:drawing>
-          <wp:inline distT="0" distB="0" distL="0" distR="0" wp14:anchorId="345D798F" wp14:editId="010D30F4">
-            <wp:extent cx="3629025" cy="4838700"/>
+          <wp:inline distT="0" distB="0" distL="0" distR="0" wp14:anchorId="361C9ABD" wp14:editId="0269021B">
+            <wp:extent cx="4086225" cy="4838700"/>
             <wp:effectExtent l="0" t="0" r="0" b="0"/>
             <wp:docPr id="12" name="Control Laboratory Session" descr="System use case diagram for Control Laboratory Session" title="Control Laboratory Session system use case"/>
             <wp:cNvGraphicFramePr>
@@ -9068,7 +9080,7 @@
                   <pic:spPr bwMode="auto">
                     <a:xfrm>
                       <a:off x="0" y="0"/>
-                      <a:ext cx="3629025" cy="4838700"/>
+                      <a:ext cx="4086225" cy="4838700"/>
                     </a:xfrm>
                     <a:prstGeom prst="rect">
                       <a:avLst/>
@@ -9143,10 +9155,7 @@
         <w:t>Purpose:</w:t>
       </w:r>
       <w:r>
-        <w:t xml:space="preserve"> </w:t>
-      </w:r>
-      <w:r>
-        <w:t>To allow the Admin and Teacher to pause, resume or end all the student sessions in the lab at once.</w:t>
+        <w:t xml:space="preserve"> To allow the Admin and Teacher to pause, resume or end all the student sessions in the lab at once.</w:t>
       </w:r>
     </w:p>
     <w:p>
@@ -9470,7 +9479,7 @@
         <w:jc w:val="both"/>
       </w:pPr>
       <w:r>
-        <w:t>The Teacher inherits this use case from the Admin (generalization).</w:t>
+        <w:t>The Admin and Teacher share this use case. The diagram shows them as one Admin / Teacher actor.</w:t>
       </w:r>
     </w:p>
     <w:p>
@@ -9504,7 +9513,7 @@
         <w:pStyle w:val="Heading1"/>
         <w:pageBreakBefore/>
       </w:pPr>
-      <w:bookmarkStart w:id="14" w:name="_Toc241751601"/>
+      <w:bookmarkStart w:id="14" w:name="_Toc241760983"/>
       <w:r>
         <w:lastRenderedPageBreak/>
         <w:t>ADMIN</w:t>
@@ -9515,7 +9524,7 @@
       <w:pPr>
         <w:pStyle w:val="Heading2"/>
       </w:pPr>
-      <w:bookmarkStart w:id="15" w:name="_Toc241751602"/>
+      <w:bookmarkStart w:id="15" w:name="_Toc241760984"/>
       <w:r>
         <w:t>Manage Admin Account</w:t>
       </w:r>
@@ -9533,7 +9542,7 @@
           <w:noProof/>
         </w:rPr>
         <w:drawing>
-          <wp:inline distT="0" distB="0" distL="0" distR="0" wp14:anchorId="721BB77C" wp14:editId="2C5B0EC1">
+          <wp:inline distT="0" distB="0" distL="0" distR="0" wp14:anchorId="11827731" wp14:editId="55233AD0">
             <wp:extent cx="3581400" cy="4838700"/>
             <wp:effectExtent l="0" t="0" r="0" b="0"/>
             <wp:docPr id="13" name="Manage Admin Account" descr="System use case diagram for Manage Admin Account" title="Manage Admin Account system use case"/>
@@ -9618,26 +9627,26 @@
         <w:t>Use Case Name:</w:t>
       </w:r>
       <w:r>
+        <w:t xml:space="preserve"> Create Admin, Update Admin, Toggle Admin Status</w:t>
+      </w:r>
+    </w:p>
+    <w:p>
+      <w:pPr>
+        <w:ind w:left="720"/>
+        <w:jc w:val="both"/>
+      </w:pPr>
+      <w:r>
+        <w:rPr>
+          <w:b/>
+          <w:bCs/>
+        </w:rPr>
+        <w:t>Purpose:</w:t>
+      </w:r>
+      <w:r>
         <w:t xml:space="preserve"> </w:t>
       </w:r>
       <w:r>
-        <w:t>Create Admin, Update Admin, Toggle Admin Status</w:t>
-      </w:r>
-    </w:p>
-    <w:p>
-      <w:pPr>
-        <w:ind w:left="720"/>
-        <w:jc w:val="both"/>
-      </w:pPr>
-      <w:r>
-        <w:rPr>
-          <w:b/>
-          <w:bCs/>
-        </w:rPr>
-        <w:t>Purpose:</w:t>
-      </w:r>
-      <w:r>
-        <w:t xml:space="preserve"> To allow the Admin to manage admin accounts in CAMS by adding, editing, and activating or deactivating accounts.</w:t>
+        <w:t>To allow the Admin to manage admin accounts in CAMS by adding, editing, and activating or deactivating accounts.</w:t>
       </w:r>
     </w:p>
     <w:p>
@@ -10074,7 +10083,7 @@
         <w:pStyle w:val="Heading2"/>
         <w:pageBreakBefore/>
       </w:pPr>
-      <w:bookmarkStart w:id="16" w:name="_Toc241751603"/>
+      <w:bookmarkStart w:id="16" w:name="_Toc241760985"/>
       <w:r>
         <w:lastRenderedPageBreak/>
         <w:t>Manage Class Teacher</w:t>
@@ -10093,7 +10102,7 @@
           <w:noProof/>
         </w:rPr>
         <w:drawing>
-          <wp:inline distT="0" distB="0" distL="0" distR="0" wp14:anchorId="3C51C71F" wp14:editId="2850D544">
+          <wp:inline distT="0" distB="0" distL="0" distR="0" wp14:anchorId="43942E41" wp14:editId="26BF54A6">
             <wp:extent cx="3581400" cy="2362200"/>
             <wp:effectExtent l="0" t="0" r="0" b="0"/>
             <wp:docPr id="14" name="Manage Class Teacher" descr="System use case diagram for Manage Class Teacher" title="Manage Class Teacher system use case"/>
@@ -10178,7 +10187,10 @@
         <w:t>Use Case Name:</w:t>
       </w:r>
       <w:r>
-        <w:t xml:space="preserve"> Assign Class Teacher</w:t>
+        <w:t xml:space="preserve"> </w:t>
+      </w:r>
+      <w:r>
+        <w:t>Assign Class Teacher</w:t>
       </w:r>
     </w:p>
     <w:p>
@@ -10592,7 +10604,7 @@
         <w:pStyle w:val="Heading2"/>
         <w:pageBreakBefore/>
       </w:pPr>
-      <w:bookmarkStart w:id="17" w:name="_Toc241751604"/>
+      <w:bookmarkStart w:id="17" w:name="_Toc241760986"/>
       <w:r>
         <w:lastRenderedPageBreak/>
         <w:t>Export Reports and Logs</w:t>
@@ -10611,7 +10623,7 @@
           <w:noProof/>
         </w:rPr>
         <w:drawing>
-          <wp:inline distT="0" distB="0" distL="0" distR="0" wp14:anchorId="401265D9" wp14:editId="1CDA0F00">
+          <wp:inline distT="0" distB="0" distL="0" distR="0" wp14:anchorId="151F2066" wp14:editId="662AB674">
             <wp:extent cx="4114800" cy="3448050"/>
             <wp:effectExtent l="0" t="0" r="0" b="0"/>
             <wp:docPr id="15" name="Export Reports and Logs" descr="System use case diagram for Export Reports and Logs" title="Export Reports and Logs system use case"/>
@@ -10712,7 +10724,10 @@
         <w:t>Purpose:</w:t>
       </w:r>
       <w:r>
-        <w:t xml:space="preserve"> To allow the Admin to view the lab reports, the audit trail and the system logs, and to download them as CSV files.</w:t>
+        <w:t xml:space="preserve"> </w:t>
+      </w:r>
+      <w:r>
+        <w:t>To allow the Admin to view the lab reports, the audit trail and the system logs, and to download them as CSV files.</w:t>
       </w:r>
     </w:p>
     <w:p>
@@ -11057,7 +11072,7 @@
         <w:pStyle w:val="Heading2"/>
         <w:pageBreakBefore/>
       </w:pPr>
-      <w:bookmarkStart w:id="18" w:name="_Toc241751605"/>
+      <w:bookmarkStart w:id="18" w:name="_Toc241760987"/>
       <w:r>
         <w:lastRenderedPageBreak/>
         <w:t>Manage Database</w:t>
@@ -11076,7 +11091,7 @@
           <w:noProof/>
         </w:rPr>
         <w:drawing>
-          <wp:inline distT="0" distB="0" distL="0" distR="0" wp14:anchorId="747E2C51" wp14:editId="27771DE8">
+          <wp:inline distT="0" distB="0" distL="0" distR="0" wp14:anchorId="0FA67256" wp14:editId="7F7CF9D2">
             <wp:extent cx="4114800" cy="4343400"/>
             <wp:effectExtent l="0" t="0" r="0" b="0"/>
             <wp:docPr id="16" name="Manage Database" descr="System use case diagram for Manage Database" title="Manage Database system use case"/>
@@ -11614,7 +11629,7 @@
         <w:pStyle w:val="Heading2"/>
         <w:pageBreakBefore/>
       </w:pPr>
-      <w:bookmarkStart w:id="19" w:name="_Toc241751606"/>
+      <w:bookmarkStart w:id="19" w:name="_Toc241760988"/>
       <w:r>
         <w:lastRenderedPageBreak/>
         <w:t>Manage Deployment</w:t>
@@ -11633,7 +11648,7 @@
           <w:noProof/>
         </w:rPr>
         <w:drawing>
-          <wp:inline distT="0" distB="0" distL="0" distR="0" wp14:anchorId="1FC31823" wp14:editId="1A81BBCD">
+          <wp:inline distT="0" distB="0" distL="0" distR="0" wp14:anchorId="7888F069" wp14:editId="387BE78D">
             <wp:extent cx="3581400" cy="3600450"/>
             <wp:effectExtent l="0" t="0" r="0" b="0"/>
             <wp:docPr id="17" name="Manage Deployment" descr="System use case diagram for Manage Deployment" title="Manage Deployment system use case"/>
@@ -12109,7 +12124,7 @@
         <w:pStyle w:val="Heading1"/>
         <w:pageBreakBefore/>
       </w:pPr>
-      <w:bookmarkStart w:id="20" w:name="_Toc241751607"/>
+      <w:bookmarkStart w:id="20" w:name="_Toc241760989"/>
       <w:r>
         <w:lastRenderedPageBreak/>
         <w:t>TEACHER</w:t>
@@ -12120,7 +12135,7 @@
       <w:pPr>
         <w:pStyle w:val="Heading2"/>
       </w:pPr>
-      <w:bookmarkStart w:id="21" w:name="_Toc241751608"/>
+      <w:bookmarkStart w:id="21" w:name="_Toc241760990"/>
       <w:r>
         <w:t>Control Student Session</w:t>
       </w:r>
@@ -12138,7 +12153,7 @@
           <w:noProof/>
         </w:rPr>
         <w:drawing>
-          <wp:inline distT="0" distB="0" distL="0" distR="0" wp14:anchorId="7E0E6D14" wp14:editId="0A7B8EA8">
+          <wp:inline distT="0" distB="0" distL="0" distR="0" wp14:anchorId="046EEC5C" wp14:editId="2E6E3A9F">
             <wp:extent cx="3629025" cy="4838700"/>
             <wp:effectExtent l="0" t="0" r="0" b="0"/>
             <wp:docPr id="18" name="Control Student Session" descr="System use case diagram for Control Student Session" title="Control Student Session system use case"/>
@@ -12651,7 +12666,7 @@
         <w:pStyle w:val="Heading2"/>
         <w:pageBreakBefore/>
       </w:pPr>
-      <w:bookmarkStart w:id="22" w:name="_Toc241751609"/>
+      <w:bookmarkStart w:id="22" w:name="_Toc241760991"/>
       <w:r>
         <w:lastRenderedPageBreak/>
         <w:t>Monitor Student Screen</w:t>
@@ -12670,7 +12685,7 @@
           <w:noProof/>
         </w:rPr>
         <w:drawing>
-          <wp:inline distT="0" distB="0" distL="0" distR="0" wp14:anchorId="411C7635" wp14:editId="7BEFAB6A">
+          <wp:inline distT="0" distB="0" distL="0" distR="0" wp14:anchorId="55CBBE40" wp14:editId="044E8AF3">
             <wp:extent cx="4114800" cy="1666875"/>
             <wp:effectExtent l="0" t="0" r="0" b="0"/>
             <wp:docPr id="19" name="Monitor Student Screen" descr="System use case diagram for Monitor Student Screen" title="Monitor Student Screen system use case"/>
@@ -13080,7 +13095,7 @@
         <w:pStyle w:val="Heading2"/>
         <w:pageBreakBefore/>
       </w:pPr>
-      <w:bookmarkStart w:id="23" w:name="_Toc241751610"/>
+      <w:bookmarkStart w:id="23" w:name="_Toc241760992"/>
       <w:r>
         <w:lastRenderedPageBreak/>
         <w:t>Control Student Workstation</w:t>
@@ -13099,7 +13114,7 @@
           <w:noProof/>
         </w:rPr>
         <w:drawing>
-          <wp:inline distT="0" distB="0" distL="0" distR="0" wp14:anchorId="348FEB62" wp14:editId="1045DB68">
+          <wp:inline distT="0" distB="0" distL="0" distR="0" wp14:anchorId="54353CC1" wp14:editId="1968A5F6">
             <wp:extent cx="3171825" cy="5334000"/>
             <wp:effectExtent l="0" t="0" r="0" b="0"/>
             <wp:docPr id="20" name="Control Student Workstation" descr="System use case diagram for Control Student Workstation" title="Control Student Workstation system use case"/>
@@ -13654,7 +13669,7 @@
         <w:pStyle w:val="Heading2"/>
         <w:pageBreakBefore/>
       </w:pPr>
-      <w:bookmarkStart w:id="24" w:name="_Toc241751611"/>
+      <w:bookmarkStart w:id="24" w:name="_Toc241760993"/>
       <w:r>
         <w:lastRenderedPageBreak/>
         <w:t>Send Message to Student</w:t>
@@ -13673,7 +13688,7 @@
           <w:noProof/>
         </w:rPr>
         <w:drawing>
-          <wp:inline distT="0" distB="0" distL="0" distR="0" wp14:anchorId="62FEDF39" wp14:editId="66C6819E">
+          <wp:inline distT="0" distB="0" distL="0" distR="0" wp14:anchorId="5EB38CC8" wp14:editId="292CBA43">
             <wp:extent cx="3629025" cy="3600450"/>
             <wp:effectExtent l="0" t="0" r="0" b="0"/>
             <wp:docPr id="21" name="Send Message to Student" descr="System use case diagram for Send Message to Student" title="Send Message to Student system use case"/>
@@ -14172,7 +14187,7 @@
         <w:pStyle w:val="Heading2"/>
         <w:pageBreakBefore/>
       </w:pPr>
-      <w:bookmarkStart w:id="25" w:name="_Toc241751612"/>
+      <w:bookmarkStart w:id="25" w:name="_Toc241760994"/>
       <w:r>
         <w:lastRenderedPageBreak/>
         <w:t>Manage Monitoring Alert</w:t>
@@ -14191,7 +14206,7 @@
           <w:noProof/>
         </w:rPr>
         <w:drawing>
-          <wp:inline distT="0" distB="0" distL="0" distR="0" wp14:anchorId="68678A86" wp14:editId="673A27BF">
+          <wp:inline distT="0" distB="0" distL="0" distR="0" wp14:anchorId="33F25B81" wp14:editId="73AD426C">
             <wp:extent cx="4114800" cy="2543175"/>
             <wp:effectExtent l="0" t="0" r="0" b="0"/>
             <wp:docPr id="22" name="Manage Monitoring Alert" descr="System use case diagram for Manage Monitoring Alert" title="Manage Monitoring Alert system use case"/>
@@ -14693,7 +14708,7 @@
         <w:pStyle w:val="Heading2"/>
         <w:pageBreakBefore/>
       </w:pPr>
-      <w:bookmarkStart w:id="26" w:name="_Toc241751613"/>
+      <w:bookmarkStart w:id="26" w:name="_Toc241760995"/>
       <w:r>
         <w:lastRenderedPageBreak/>
         <w:t>Export Teacher Records</w:t>
@@ -14712,7 +14727,7 @@
           <w:noProof/>
         </w:rPr>
         <w:drawing>
-          <wp:inline distT="0" distB="0" distL="0" distR="0" wp14:anchorId="3D13A7E6" wp14:editId="361CF068">
+          <wp:inline distT="0" distB="0" distL="0" distR="0" wp14:anchorId="58DA0BEA" wp14:editId="4007F264">
             <wp:extent cx="4114800" cy="3419475"/>
             <wp:effectExtent l="0" t="0" r="0" b="0"/>
             <wp:docPr id="23" name="Export Teacher Records" descr="System use case diagram for Export Teacher Records" title="Export Teacher Records system use case"/>
@@ -15148,7 +15163,7 @@
         <w:pStyle w:val="Heading1"/>
         <w:pageBreakBefore/>
       </w:pPr>
-      <w:bookmarkStart w:id="27" w:name="_Toc241751614"/>
+      <w:bookmarkStart w:id="27" w:name="_Toc241760996"/>
       <w:r>
         <w:lastRenderedPageBreak/>
         <w:t>STUDENT</w:t>
@@ -15159,7 +15174,7 @@
       <w:pPr>
         <w:pStyle w:val="Heading2"/>
       </w:pPr>
-      <w:bookmarkStart w:id="28" w:name="_Toc241751615"/>
+      <w:bookmarkStart w:id="28" w:name="_Toc241760997"/>
       <w:r>
         <w:t>Log In at Workstation</w:t>
       </w:r>
@@ -15177,7 +15192,7 @@
           <w:noProof/>
         </w:rPr>
         <w:drawing>
-          <wp:inline distT="0" distB="0" distL="0" distR="0" wp14:anchorId="0F3F950F" wp14:editId="15461AAC">
+          <wp:inline distT="0" distB="0" distL="0" distR="0" wp14:anchorId="0BEAACC4" wp14:editId="44F284CA">
             <wp:extent cx="4114800" cy="2552700"/>
             <wp:effectExtent l="0" t="0" r="0" b="0"/>
             <wp:docPr id="24" name="Log In at Workstation" descr="System use case diagram for Log In at Workstation" title="Log In at Workstation system use case"/>
@@ -15743,7 +15758,7 @@
         <w:pStyle w:val="Heading2"/>
         <w:pageBreakBefore/>
       </w:pPr>
-      <w:bookmarkStart w:id="29" w:name="_Toc241751616"/>
+      <w:bookmarkStart w:id="29" w:name="_Toc241760998"/>
       <w:r>
         <w:lastRenderedPageBreak/>
         <w:t>Log Out at Workstation</w:t>
@@ -15762,7 +15777,7 @@
           <w:noProof/>
         </w:rPr>
         <w:drawing>
-          <wp:inline distT="0" distB="0" distL="0" distR="0" wp14:anchorId="3D79F121" wp14:editId="0A24651F">
+          <wp:inline distT="0" distB="0" distL="0" distR="0" wp14:anchorId="26DD0BF5" wp14:editId="09206FED">
             <wp:extent cx="4114800" cy="3209925"/>
             <wp:effectExtent l="0" t="0" r="0" b="0"/>
             <wp:docPr id="25" name="Log Out at Workstation" descr="System use case diagram for Log Out at Workstation" title="Log Out at Workstation system use case"/>
@@ -16146,7 +16161,7 @@
         <w:pStyle w:val="Heading2"/>
         <w:pageBreakBefore/>
       </w:pPr>
-      <w:bookmarkStart w:id="30" w:name="_Toc241751617"/>
+      <w:bookmarkStart w:id="30" w:name="_Toc241760999"/>
       <w:r>
         <w:lastRenderedPageBreak/>
         <w:t>Change Password at Workstation</w:t>
@@ -16165,7 +16180,7 @@
           <w:noProof/>
         </w:rPr>
         <w:drawing>
-          <wp:inline distT="0" distB="0" distL="0" distR="0" wp14:anchorId="3147F97B" wp14:editId="313AA566">
+          <wp:inline distT="0" distB="0" distL="0" distR="0" wp14:anchorId="3C729A3C" wp14:editId="1393C00C">
             <wp:extent cx="3619500" cy="2362200"/>
             <wp:effectExtent l="0" t="0" r="0" b="0"/>
             <wp:docPr id="26" name="Change Password at Workstation" descr="System use case diagram for Change Password at Workstation" title="Change Password at Workstation system use case"/>
@@ -16761,96 +16776,10 @@
 <file path=word/numbering.xml><?xml version="1.0" encoding="utf-8"?>
 <w:numbering xmlns:wpc="http://schemas.microsoft.com/office/word/2010/wordprocessingCanvas" xmlns:cx="http://schemas.microsoft.com/office/drawing/2014/chartex" xmlns:cx1="http://schemas.microsoft.com/office/drawing/2015/9/8/chartex" xmlns:cx2="http://schemas.microsoft.com/office/drawing/2015/10/21/chartex" xmlns:cx3="http://schemas.microsoft.com/office/drawing/2016/5/9/chartex" xmlns:cx4="http://schemas.microsoft.com/office/drawing/2016/5/10/chartex" xmlns:cx5="http://schemas.microsoft.com/office/drawing/2016/5/11/chartex" xmlns:cx6="http://schemas.microsoft.com/office/drawing/2016/5/12/chartex" xmlns:cx7="http://schemas.microsoft.com/office/drawing/2016/5/13/chartex" xmlns:cx8="http://schemas.microsoft.com/office/drawing/2016/5/14/chartex" xmlns:mc="http://schemas.openxmlformats.org/markup-compatibility/2006" xmlns:aink="http://schemas.microsoft.com/office/drawing/2016/ink" xmlns:am3d="http://schemas.microsoft.com/office/drawing/2017/model3d" xmlns:o="urn:schemas-microsoft-com:office:office" xmlns:oel="http://schemas.microsoft.com/office/2019/extlst" xmlns:r="http://schemas.openxmlformats.org/officeDocument/2006/relationships" xmlns:m="http://schemas.openxmlformats.org/officeDocument/2006/math" xmlns:v="urn:schemas-microsoft-com:vml" xmlns:wp14="http://schemas.microsoft.com/office/word/2010/wordprocessingDrawing" xmlns:wp="http://schemas.openxmlformats.org/drawingml/2006/wordprocessingDrawing" xmlns:w10="urn:schemas-microsoft-com:office:word" xmlns:w="http://schemas.openxmlformats.org/wordprocessingml/2006/main" xmlns:w14="http://schemas.microsoft.com/office/word/2010/wordml" xmlns:w15="http://schemas.microsoft.com/office/word/2012/wordml" xmlns:w16cex="http://schemas.microsoft.com/office/word/2018/wordml/cex" xmlns:w16cid="http://schemas.microsoft.com/office/word/2016/wordml/cid" xmlns:w16="http://schemas.microsoft.com/office/word/2018/wordml" xmlns:w16du="http://schemas.microsoft.com/office/word/2023/wordml/word16du" xmlns:w16sdtdh="http://schemas.microsoft.com/office/word/2020/wordml/sdtdatahash" xmlns:w16sdtfl="http://schemas.microsoft.com/office/word/2024/wordml/sdtformatlock" xmlns:w16se="http://schemas.microsoft.com/office/word/2015/wordml/symex" xmlns:wpg="http://schemas.microsoft.com/office/word/2010/wordprocessingGroup" xmlns:wpi="http://schemas.microsoft.com/office/word/2010/wordprocessingInk" xmlns:wne="http://schemas.microsoft.com/office/word/2006/wordml" xmlns:wps="http://schemas.microsoft.com/office/word/2010/wordprocessingShape" mc:Ignorable="w14 w15 w16se w16cid w16 w16cex w16sdtdh w16sdtfl w16du wp14">
   <w:abstractNum w:abstractNumId="0" w15:restartNumberingAfterBreak="0">
-    <w:nsid w:val="2AA81DF2"/>
+    <w:nsid w:val="553C2210"/>
     <w:multiLevelType w:val="hybridMultilevel"/>
-    <w:tmpl w:val="B20AA1C0"/>
-    <w:lvl w:ilvl="0" w:tplc="C76AB4EE" w:tentative="1">
-      <w:start w:val="1"/>
-      <w:numFmt w:val="bullet"/>
-      <w:lvlText w:val="●"/>
-      <w:lvlJc w:val="left"/>
-      <w:pPr>
-        <w:ind w:left="720" w:hanging="360"/>
-      </w:pPr>
-    </w:lvl>
-    <w:lvl w:ilvl="1" w:tplc="9EAA7B8E" w:tentative="1">
-      <w:start w:val="1"/>
-      <w:numFmt w:val="bullet"/>
-      <w:lvlText w:val="○"/>
-      <w:lvlJc w:val="left"/>
-      <w:pPr>
-        <w:ind w:left="1440" w:hanging="360"/>
-      </w:pPr>
-    </w:lvl>
-    <w:lvl w:ilvl="2" w:tplc="86887A1C" w:tentative="1">
-      <w:start w:val="1"/>
-      <w:numFmt w:val="bullet"/>
-      <w:lvlText w:val="■"/>
-      <w:lvlJc w:val="left"/>
-      <w:pPr>
-        <w:ind w:left="2160" w:hanging="360"/>
-      </w:pPr>
-    </w:lvl>
-    <w:lvl w:ilvl="3" w:tplc="05B6935C" w:tentative="1">
-      <w:start w:val="1"/>
-      <w:numFmt w:val="bullet"/>
-      <w:lvlText w:val="●"/>
-      <w:lvlJc w:val="left"/>
-      <w:pPr>
-        <w:ind w:left="2880" w:hanging="360"/>
-      </w:pPr>
-    </w:lvl>
-    <w:lvl w:ilvl="4" w:tplc="B8ECEA46" w:tentative="1">
-      <w:start w:val="1"/>
-      <w:numFmt w:val="bullet"/>
-      <w:lvlText w:val="○"/>
-      <w:lvlJc w:val="left"/>
-      <w:pPr>
-        <w:ind w:left="3600" w:hanging="360"/>
-      </w:pPr>
-    </w:lvl>
-    <w:lvl w:ilvl="5" w:tplc="3E88326E" w:tentative="1">
-      <w:start w:val="1"/>
-      <w:numFmt w:val="bullet"/>
-      <w:lvlText w:val="■"/>
-      <w:lvlJc w:val="left"/>
-      <w:pPr>
-        <w:ind w:left="4320" w:hanging="360"/>
-      </w:pPr>
-    </w:lvl>
-    <w:lvl w:ilvl="6" w:tplc="25F6BCDA" w:tentative="1">
-      <w:start w:val="1"/>
-      <w:numFmt w:val="bullet"/>
-      <w:lvlText w:val="●"/>
-      <w:lvlJc w:val="left"/>
-      <w:pPr>
-        <w:ind w:left="5040" w:hanging="360"/>
-      </w:pPr>
-    </w:lvl>
-    <w:lvl w:ilvl="7" w:tplc="691E010C" w:tentative="1">
-      <w:start w:val="1"/>
-      <w:numFmt w:val="bullet"/>
-      <w:lvlText w:val="●"/>
-      <w:lvlJc w:val="left"/>
-      <w:pPr>
-        <w:ind w:left="5760" w:hanging="360"/>
-      </w:pPr>
-    </w:lvl>
-    <w:lvl w:ilvl="8" w:tplc="6BFC3CE0" w:tentative="1">
-      <w:start w:val="1"/>
-      <w:numFmt w:val="bullet"/>
-      <w:lvlText w:val="●"/>
-      <w:lvlJc w:val="left"/>
-      <w:pPr>
-        <w:ind w:left="6480" w:hanging="360"/>
-      </w:pPr>
-    </w:lvl>
-  </w:abstractNum>
-  <w:abstractNum w:abstractNumId="1" w15:restartNumberingAfterBreak="0">
-    <w:nsid w:val="412B5DE3"/>
-    <w:multiLevelType w:val="hybridMultilevel"/>
-    <w:tmpl w:val="40A2F468"/>
-    <w:lvl w:ilvl="0" w:tplc="C7E40D3A">
+    <w:tmpl w:val="D7D490C6"/>
+    <w:lvl w:ilvl="0" w:tplc="75DA8F46">
       <w:start w:val="1"/>
       <w:numFmt w:val="decimal"/>
       <w:lvlText w:val="%1."/>
@@ -16859,275 +16788,361 @@
         <w:ind w:left="1440" w:hanging="360"/>
       </w:pPr>
     </w:lvl>
-    <w:lvl w:ilvl="1" w:tplc="C39A5C20">
+    <w:lvl w:ilvl="1" w:tplc="DEF84C40">
       <w:numFmt w:val="decimal"/>
       <w:lvlText w:val=""/>
       <w:lvlJc w:val="left"/>
     </w:lvl>
-    <w:lvl w:ilvl="2" w:tplc="BBFAF24C">
+    <w:lvl w:ilvl="2" w:tplc="9ECC90D4">
       <w:numFmt w:val="decimal"/>
       <w:lvlText w:val=""/>
       <w:lvlJc w:val="left"/>
     </w:lvl>
-    <w:lvl w:ilvl="3" w:tplc="CE8EB954">
+    <w:lvl w:ilvl="3" w:tplc="8D1E622A">
       <w:numFmt w:val="decimal"/>
       <w:lvlText w:val=""/>
       <w:lvlJc w:val="left"/>
     </w:lvl>
-    <w:lvl w:ilvl="4" w:tplc="47F4AB2C">
+    <w:lvl w:ilvl="4" w:tplc="44E0D9CC">
       <w:numFmt w:val="decimal"/>
       <w:lvlText w:val=""/>
       <w:lvlJc w:val="left"/>
     </w:lvl>
-    <w:lvl w:ilvl="5" w:tplc="3C18E548">
+    <w:lvl w:ilvl="5" w:tplc="EDE85EA4">
       <w:numFmt w:val="decimal"/>
       <w:lvlText w:val=""/>
       <w:lvlJc w:val="left"/>
     </w:lvl>
-    <w:lvl w:ilvl="6" w:tplc="BD0AABFC">
+    <w:lvl w:ilvl="6" w:tplc="585C1D88">
       <w:numFmt w:val="decimal"/>
       <w:lvlText w:val=""/>
       <w:lvlJc w:val="left"/>
     </w:lvl>
-    <w:lvl w:ilvl="7" w:tplc="64C8BCF0">
+    <w:lvl w:ilvl="7" w:tplc="3EEEA6B6">
       <w:numFmt w:val="decimal"/>
       <w:lvlText w:val=""/>
       <w:lvlJc w:val="left"/>
     </w:lvl>
-    <w:lvl w:ilvl="8" w:tplc="F46204F4">
+    <w:lvl w:ilvl="8" w:tplc="21FAFF8A">
+      <w:numFmt w:val="decimal"/>
+      <w:lvlText w:val=""/>
+      <w:lvlJc w:val="left"/>
+    </w:lvl>
+  </w:abstractNum>
+  <w:abstractNum w:abstractNumId="1" w15:restartNumberingAfterBreak="0">
+    <w:nsid w:val="63AC112E"/>
+    <w:multiLevelType w:val="hybridMultilevel"/>
+    <w:tmpl w:val="A4DC0F82"/>
+    <w:lvl w:ilvl="0" w:tplc="488802C6">
+      <w:start w:val="1"/>
+      <w:numFmt w:val="bullet"/>
+      <w:lvlText w:val=""/>
+      <w:lvlJc w:val="left"/>
+      <w:pPr>
+        <w:ind w:left="1440" w:hanging="360"/>
+      </w:pPr>
+      <w:rPr>
+        <w:rFonts w:ascii="Symbol" w:eastAsia="Symbol" w:hAnsi="Symbol" w:cs="Symbol"/>
+      </w:rPr>
+    </w:lvl>
+    <w:lvl w:ilvl="1" w:tplc="E5DA7C5A">
+      <w:start w:val="1"/>
+      <w:numFmt w:val="bullet"/>
+      <w:lvlText w:val="o"/>
+      <w:lvlJc w:val="left"/>
+      <w:pPr>
+        <w:ind w:left="1800" w:hanging="360"/>
+      </w:pPr>
+      <w:rPr>
+        <w:rFonts w:ascii="Courier New" w:eastAsia="Courier New" w:hAnsi="Courier New" w:cs="Courier New"/>
+      </w:rPr>
+    </w:lvl>
+    <w:lvl w:ilvl="2" w:tplc="18BC2D78">
+      <w:numFmt w:val="decimal"/>
+      <w:lvlText w:val=""/>
+      <w:lvlJc w:val="left"/>
+    </w:lvl>
+    <w:lvl w:ilvl="3" w:tplc="C6343B4A">
+      <w:numFmt w:val="decimal"/>
+      <w:lvlText w:val=""/>
+      <w:lvlJc w:val="left"/>
+    </w:lvl>
+    <w:lvl w:ilvl="4" w:tplc="07F22836">
+      <w:numFmt w:val="decimal"/>
+      <w:lvlText w:val=""/>
+      <w:lvlJc w:val="left"/>
+    </w:lvl>
+    <w:lvl w:ilvl="5" w:tplc="0CDA47F0">
+      <w:numFmt w:val="decimal"/>
+      <w:lvlText w:val=""/>
+      <w:lvlJc w:val="left"/>
+    </w:lvl>
+    <w:lvl w:ilvl="6" w:tplc="20863992">
+      <w:numFmt w:val="decimal"/>
+      <w:lvlText w:val=""/>
+      <w:lvlJc w:val="left"/>
+    </w:lvl>
+    <w:lvl w:ilvl="7" w:tplc="29505018">
+      <w:numFmt w:val="decimal"/>
+      <w:lvlText w:val=""/>
+      <w:lvlJc w:val="left"/>
+    </w:lvl>
+    <w:lvl w:ilvl="8" w:tplc="35DA65C4">
       <w:numFmt w:val="decimal"/>
       <w:lvlText w:val=""/>
       <w:lvlJc w:val="left"/>
     </w:lvl>
   </w:abstractNum>
   <w:abstractNum w:abstractNumId="2" w15:restartNumberingAfterBreak="0">
-    <w:nsid w:val="66F80D63"/>
+    <w:nsid w:val="6B737B9E"/>
     <w:multiLevelType w:val="hybridMultilevel"/>
-    <w:tmpl w:val="7608B116"/>
-    <w:lvl w:ilvl="0" w:tplc="1796220C">
+    <w:tmpl w:val="96D27918"/>
+    <w:lvl w:ilvl="0" w:tplc="19C0191E" w:tentative="1">
       <w:start w:val="1"/>
       <w:numFmt w:val="bullet"/>
-      <w:lvlText w:val=""/>
+      <w:lvlText w:val="●"/>
       <w:lvlJc w:val="left"/>
       <w:pPr>
-        <w:ind w:left="1440" w:hanging="360"/>
-      </w:pPr>
-      <w:rPr>
-        <w:rFonts w:ascii="Symbol" w:eastAsia="Symbol" w:hAnsi="Symbol" w:cs="Symbol"/>
-      </w:rPr>
+        <w:ind w:left="720" w:hanging="360"/>
+      </w:pPr>
     </w:lvl>
-    <w:lvl w:ilvl="1" w:tplc="8A460AFA">
+    <w:lvl w:ilvl="1" w:tplc="1CCE7292" w:tentative="1">
       <w:start w:val="1"/>
       <w:numFmt w:val="bullet"/>
-      <w:lvlText w:val="o"/>
+      <w:lvlText w:val="○"/>
       <w:lvlJc w:val="left"/>
       <w:pPr>
-        <w:ind w:left="1800" w:hanging="360"/>
-      </w:pPr>
-      <w:rPr>
-        <w:rFonts w:ascii="Courier New" w:eastAsia="Courier New" w:hAnsi="Courier New" w:cs="Courier New"/>
-      </w:rPr>
+        <w:ind w:left="1440" w:hanging="360"/>
+      </w:pPr>
     </w:lvl>
-    <w:lvl w:ilvl="2" w:tplc="95CE77DC">
-      <w:numFmt w:val="decimal"/>
-      <w:lvlText w:val=""/>
+    <w:lvl w:ilvl="2" w:tplc="E4A09430" w:tentative="1">
+      <w:start w:val="1"/>
+      <w:numFmt w:val="bullet"/>
+      <w:lvlText w:val="■"/>
       <w:lvlJc w:val="left"/>
+      <w:pPr>
+        <w:ind w:left="2160" w:hanging="360"/>
+      </w:pPr>
     </w:lvl>
-    <w:lvl w:ilvl="3" w:tplc="9CC22492">
-      <w:numFmt w:val="decimal"/>
-      <w:lvlText w:val=""/>
+    <w:lvl w:ilvl="3" w:tplc="7280FCB6" w:tentative="1">
+      <w:start w:val="1"/>
+      <w:numFmt w:val="bullet"/>
+      <w:lvlText w:val="●"/>
       <w:lvlJc w:val="left"/>
+      <w:pPr>
+        <w:ind w:left="2880" w:hanging="360"/>
+      </w:pPr>
     </w:lvl>
-    <w:lvl w:ilvl="4" w:tplc="3DBA5430">
-      <w:numFmt w:val="decimal"/>
-      <w:lvlText w:val=""/>
+    <w:lvl w:ilvl="4" w:tplc="708E7F7E" w:tentative="1">
+      <w:start w:val="1"/>
+      <w:numFmt w:val="bullet"/>
+      <w:lvlText w:val="○"/>
       <w:lvlJc w:val="left"/>
+      <w:pPr>
+        <w:ind w:left="3600" w:hanging="360"/>
+      </w:pPr>
     </w:lvl>
-    <w:lvl w:ilvl="5" w:tplc="372C20F2">
-      <w:numFmt w:val="decimal"/>
-      <w:lvlText w:val=""/>
+    <w:lvl w:ilvl="5" w:tplc="7C809628" w:tentative="1">
+      <w:start w:val="1"/>
+      <w:numFmt w:val="bullet"/>
+      <w:lvlText w:val="■"/>
       <w:lvlJc w:val="left"/>
+      <w:pPr>
+        <w:ind w:left="4320" w:hanging="360"/>
+      </w:pPr>
     </w:lvl>
-    <w:lvl w:ilvl="6" w:tplc="68B42B3A">
-      <w:numFmt w:val="decimal"/>
-      <w:lvlText w:val=""/>
+    <w:lvl w:ilvl="6" w:tplc="15024D48" w:tentative="1">
+      <w:start w:val="1"/>
+      <w:numFmt w:val="bullet"/>
+      <w:lvlText w:val="●"/>
       <w:lvlJc w:val="left"/>
+      <w:pPr>
+        <w:ind w:left="5040" w:hanging="360"/>
+      </w:pPr>
     </w:lvl>
-    <w:lvl w:ilvl="7" w:tplc="BDBA0754">
-      <w:numFmt w:val="decimal"/>
-      <w:lvlText w:val=""/>
+    <w:lvl w:ilvl="7" w:tplc="252A0514" w:tentative="1">
+      <w:start w:val="1"/>
+      <w:numFmt w:val="bullet"/>
+      <w:lvlText w:val="●"/>
       <w:lvlJc w:val="left"/>
+      <w:pPr>
+        <w:ind w:left="5760" w:hanging="360"/>
+      </w:pPr>
     </w:lvl>
-    <w:lvl w:ilvl="8" w:tplc="8B74429C">
-      <w:numFmt w:val="decimal"/>
-      <w:lvlText w:val=""/>
+    <w:lvl w:ilvl="8" w:tplc="2AA8E366" w:tentative="1">
+      <w:start w:val="1"/>
+      <w:numFmt w:val="bullet"/>
+      <w:lvlText w:val="●"/>
       <w:lvlJc w:val="left"/>
+      <w:pPr>
+        <w:ind w:left="6480" w:hanging="360"/>
+      </w:pPr>
     </w:lvl>
   </w:abstractNum>
-  <w:num w:numId="1" w16cid:durableId="669216511">
+  <w:num w:numId="1" w16cid:durableId="1329285974">
+    <w:abstractNumId w:val="2"/>
+    <w:lvlOverride w:ilvl="0">
+      <w:startOverride w:val="1"/>
+    </w:lvlOverride>
+  </w:num>
+  <w:num w:numId="2" w16cid:durableId="1735277392">
+    <w:abstractNumId w:val="1"/>
+    <w:lvlOverride w:ilvl="0">
+      <w:startOverride w:val="1"/>
+    </w:lvlOverride>
+  </w:num>
+  <w:num w:numId="3" w16cid:durableId="293220734">
     <w:abstractNumId w:val="0"/>
     <w:lvlOverride w:ilvl="0">
       <w:startOverride w:val="1"/>
     </w:lvlOverride>
   </w:num>
-  <w:num w:numId="2" w16cid:durableId="234585344">
-    <w:abstractNumId w:val="2"/>
+  <w:num w:numId="4" w16cid:durableId="1800567695">
+    <w:abstractNumId w:val="0"/>
     <w:lvlOverride w:ilvl="0">
       <w:startOverride w:val="1"/>
     </w:lvlOverride>
   </w:num>
-  <w:num w:numId="3" w16cid:durableId="1469279424">
-    <w:abstractNumId w:val="1"/>
+  <w:num w:numId="5" w16cid:durableId="2141730395">
+    <w:abstractNumId w:val="0"/>
     <w:lvlOverride w:ilvl="0">
       <w:startOverride w:val="1"/>
     </w:lvlOverride>
   </w:num>
-  <w:num w:numId="4" w16cid:durableId="1776705709">
-    <w:abstractNumId w:val="1"/>
+  <w:num w:numId="6" w16cid:durableId="868878422">
+    <w:abstractNumId w:val="0"/>
     <w:lvlOverride w:ilvl="0">
       <w:startOverride w:val="1"/>
     </w:lvlOverride>
   </w:num>
-  <w:num w:numId="5" w16cid:durableId="298152130">
-    <w:abstractNumId w:val="1"/>
+  <w:num w:numId="7" w16cid:durableId="578250951">
+    <w:abstractNumId w:val="0"/>
     <w:lvlOverride w:ilvl="0">
       <w:startOverride w:val="1"/>
     </w:lvlOverride>
   </w:num>
-  <w:num w:numId="6" w16cid:durableId="902135583">
-    <w:abstractNumId w:val="1"/>
+  <w:num w:numId="8" w16cid:durableId="27486079">
+    <w:abstractNumId w:val="0"/>
     <w:lvlOverride w:ilvl="0">
       <w:startOverride w:val="1"/>
     </w:lvlOverride>
   </w:num>
-  <w:num w:numId="7" w16cid:durableId="1801533673">
-    <w:abstractNumId w:val="1"/>
+  <w:num w:numId="9" w16cid:durableId="1921744067">
+    <w:abstractNumId w:val="0"/>
     <w:lvlOverride w:ilvl="0">
       <w:startOverride w:val="1"/>
     </w:lvlOverride>
   </w:num>
-  <w:num w:numId="8" w16cid:durableId="206188932">
-    <w:abstractNumId w:val="1"/>
+  <w:num w:numId="10" w16cid:durableId="50661461">
+    <w:abstractNumId w:val="0"/>
     <w:lvlOverride w:ilvl="0">
       <w:startOverride w:val="1"/>
     </w:lvlOverride>
   </w:num>
-  <w:num w:numId="9" w16cid:durableId="924723554">
-    <w:abstractNumId w:val="1"/>
+  <w:num w:numId="11" w16cid:durableId="901139115">
+    <w:abstractNumId w:val="0"/>
     <w:lvlOverride w:ilvl="0">
       <w:startOverride w:val="1"/>
     </w:lvlOverride>
   </w:num>
-  <w:num w:numId="10" w16cid:durableId="1868759358">
-    <w:abstractNumId w:val="1"/>
+  <w:num w:numId="12" w16cid:durableId="116535406">
+    <w:abstractNumId w:val="0"/>
     <w:lvlOverride w:ilvl="0">
       <w:startOverride w:val="1"/>
     </w:lvlOverride>
   </w:num>
-  <w:num w:numId="11" w16cid:durableId="1985573626">
-    <w:abstractNumId w:val="1"/>
+  <w:num w:numId="13" w16cid:durableId="341663305">
+    <w:abstractNumId w:val="0"/>
     <w:lvlOverride w:ilvl="0">
       <w:startOverride w:val="1"/>
     </w:lvlOverride>
   </w:num>
-  <w:num w:numId="12" w16cid:durableId="1004404991">
-    <w:abstractNumId w:val="1"/>
+  <w:num w:numId="14" w16cid:durableId="731123210">
+    <w:abstractNumId w:val="0"/>
     <w:lvlOverride w:ilvl="0">
       <w:startOverride w:val="1"/>
     </w:lvlOverride>
   </w:num>
-  <w:num w:numId="13" w16cid:durableId="1478066120">
-    <w:abstractNumId w:val="1"/>
+  <w:num w:numId="15" w16cid:durableId="1129472642">
+    <w:abstractNumId w:val="0"/>
     <w:lvlOverride w:ilvl="0">
       <w:startOverride w:val="1"/>
     </w:lvlOverride>
   </w:num>
-  <w:num w:numId="14" w16cid:durableId="578095697">
-    <w:abstractNumId w:val="1"/>
+  <w:num w:numId="16" w16cid:durableId="1028724733">
+    <w:abstractNumId w:val="0"/>
     <w:lvlOverride w:ilvl="0">
       <w:startOverride w:val="1"/>
     </w:lvlOverride>
   </w:num>
-  <w:num w:numId="15" w16cid:durableId="129636021">
-    <w:abstractNumId w:val="1"/>
+  <w:num w:numId="17" w16cid:durableId="1216504683">
+    <w:abstractNumId w:val="0"/>
     <w:lvlOverride w:ilvl="0">
       <w:startOverride w:val="1"/>
     </w:lvlOverride>
   </w:num>
-  <w:num w:numId="16" w16cid:durableId="1189490886">
-    <w:abstractNumId w:val="1"/>
+  <w:num w:numId="18" w16cid:durableId="761340709">
+    <w:abstractNumId w:val="0"/>
     <w:lvlOverride w:ilvl="0">
       <w:startOverride w:val="1"/>
     </w:lvlOverride>
   </w:num>
-  <w:num w:numId="17" w16cid:durableId="1212644993">
-    <w:abstractNumId w:val="1"/>
+  <w:num w:numId="19" w16cid:durableId="1427534044">
+    <w:abstractNumId w:val="0"/>
     <w:lvlOverride w:ilvl="0">
       <w:startOverride w:val="1"/>
     </w:lvlOverride>
   </w:num>
-  <w:num w:numId="18" w16cid:durableId="1078475165">
-    <w:abstractNumId w:val="1"/>
+  <w:num w:numId="20" w16cid:durableId="1937321371">
+    <w:abstractNumId w:val="0"/>
     <w:lvlOverride w:ilvl="0">
       <w:startOverride w:val="1"/>
     </w:lvlOverride>
   </w:num>
-  <w:num w:numId="19" w16cid:durableId="1333988269">
-    <w:abstractNumId w:val="1"/>
+  <w:num w:numId="21" w16cid:durableId="1624576035">
+    <w:abstractNumId w:val="0"/>
     <w:lvlOverride w:ilvl="0">
       <w:startOverride w:val="1"/>
     </w:lvlOverride>
   </w:num>
-  <w:num w:numId="20" w16cid:durableId="1993366600">
-    <w:abstractNumId w:val="1"/>
+  <w:num w:numId="22" w16cid:durableId="719323821">
+    <w:abstractNumId w:val="0"/>
     <w:lvlOverride w:ilvl="0">
       <w:startOverride w:val="1"/>
     </w:lvlOverride>
   </w:num>
-  <w:num w:numId="21" w16cid:durableId="643236599">
-    <w:abstractNumId w:val="1"/>
+  <w:num w:numId="23" w16cid:durableId="1614748295">
+    <w:abstractNumId w:val="0"/>
     <w:lvlOverride w:ilvl="0">
       <w:startOverride w:val="1"/>
     </w:lvlOverride>
   </w:num>
-  <w:num w:numId="22" w16cid:durableId="852499293">
-    <w:abstractNumId w:val="1"/>
+  <w:num w:numId="24" w16cid:durableId="2009093193">
+    <w:abstractNumId w:val="0"/>
     <w:lvlOverride w:ilvl="0">
       <w:startOverride w:val="1"/>
     </w:lvlOverride>
   </w:num>
-  <w:num w:numId="23" w16cid:durableId="1379819484">
-    <w:abstractNumId w:val="1"/>
+  <w:num w:numId="25" w16cid:durableId="984626815">
+    <w:abstractNumId w:val="0"/>
     <w:lvlOverride w:ilvl="0">
       <w:startOverride w:val="1"/>
     </w:lvlOverride>
   </w:num>
-  <w:num w:numId="24" w16cid:durableId="2106611000">
-    <w:abstractNumId w:val="1"/>
+  <w:num w:numId="26" w16cid:durableId="985671885">
+    <w:abstractNumId w:val="0"/>
     <w:lvlOverride w:ilvl="0">
       <w:startOverride w:val="1"/>
     </w:lvlOverride>
   </w:num>
-  <w:num w:numId="25" w16cid:durableId="437330828">
-    <w:abstractNumId w:val="1"/>
+  <w:num w:numId="27" w16cid:durableId="1985894160">
+    <w:abstractNumId w:val="0"/>
     <w:lvlOverride w:ilvl="0">
       <w:startOverride w:val="1"/>
     </w:lvlOverride>
   </w:num>
-  <w:num w:numId="26" w16cid:durableId="2076003029">
-    <w:abstractNumId w:val="1"/>
-    <w:lvlOverride w:ilvl="0">
-      <w:startOverride w:val="1"/>
-    </w:lvlOverride>
-  </w:num>
-  <w:num w:numId="27" w16cid:durableId="1234776542">
-    <w:abstractNumId w:val="1"/>
-    <w:lvlOverride w:ilvl="0">
-      <w:startOverride w:val="1"/>
-    </w:lvlOverride>
-  </w:num>
-  <w:num w:numId="28" w16cid:durableId="1804075295">
-    <w:abstractNumId w:val="1"/>
+  <w:num w:numId="28" w16cid:durableId="1741053226">
+    <w:abstractNumId w:val="0"/>
     <w:lvlOverride w:ilvl="0">
       <w:startOverride w:val="1"/>
     </w:lvlOverride>
@@ -17760,7 +17775,7 @@
     <w:autoRedefine/>
     <w:uiPriority w:val="39"/>
     <w:unhideWhenUsed/>
-    <w:rsid w:val="00C26A5D"/>
+    <w:rsid w:val="002939C4"/>
     <w:pPr>
       <w:spacing w:after="100"/>
     </w:pPr>
@@ -17775,7 +17790,7 @@
     <w:autoRedefine/>
     <w:uiPriority w:val="39"/>
     <w:unhideWhenUsed/>
-    <w:rsid w:val="00C26A5D"/>
+    <w:rsid w:val="002939C4"/>
     <w:pPr>
       <w:spacing w:after="100"/>
       <w:ind w:left="240"/>

</xml_diff>